<commit_message>
correccion de trabajo de base de datos en MySQL
</commit_message>
<xml_diff>
--- a/Modelo De Base de Datos/Actividad 4/Modelo Relacional de Bases de Datos en Herramienta Computacional.docx
+++ b/Modelo De Base de Datos/Actividad 4/Modelo Relacional de Bases de Datos en Herramienta Computacional.docx
@@ -554,7 +554,7 @@
           <w:sz w:val="24"/>
           <w:szCs w:val="24"/>
         </w:rPr>
-        <w:t>17</w:t>
+        <w:t>24</w:t>
       </w:r>
       <w:r>
         <w:rPr>
@@ -647,7 +647,11 @@
     <w:sdt>
       <w:sdtPr>
         <w:rPr>
-          <w:lang w:val="es-ES"/>
+          <w:rFonts w:asciiTheme="minorHAnsi" w:eastAsiaTheme="minorHAnsi" w:hAnsiTheme="minorHAnsi" w:cstheme="minorBidi"/>
+          <w:color w:val="auto"/>
+          <w:sz w:val="22"/>
+          <w:szCs w:val="22"/>
+          <w:lang w:val="es-ES" w:eastAsia="en-US"/>
         </w:rPr>
         <w:id w:val="-1453474681"/>
         <w:docPartObj>
@@ -657,13 +661,8 @@
       </w:sdtPr>
       <w:sdtEndPr>
         <w:rPr>
-          <w:rFonts w:asciiTheme="minorHAnsi" w:eastAsiaTheme="minorHAnsi" w:hAnsiTheme="minorHAnsi" w:cstheme="minorBidi"/>
           <w:b/>
           <w:bCs/>
-          <w:color w:val="auto"/>
-          <w:sz w:val="22"/>
-          <w:szCs w:val="22"/>
-          <w:lang w:eastAsia="en-US"/>
         </w:rPr>
       </w:sdtEndPr>
       <w:sdtContent>
@@ -1667,6 +1666,7 @@
       <w:r>
         <w:rPr>
           <w:rFonts w:ascii="Arial" w:hAnsi="Arial" w:cs="Arial"/>
+          <w:noProof/>
           <w:sz w:val="28"/>
           <w:szCs w:val="28"/>
         </w:rPr>
@@ -1764,14 +1764,7 @@
     <w:p>
       <w:pPr>
         <w:pStyle w:val="Prrafodelista"/>
-        <w:numPr>
-          <w:ilvl w:val="0"/>
-          <w:numId w:val="9"/>
-        </w:numPr>
-      </w:pPr>
-      <w:r>
-        <w:t>Llave foránea (FK) código del libro</w:t>
-      </w:r>
+      </w:pPr>
     </w:p>
     <w:tbl>
       <w:tblPr>
@@ -1961,144 +1954,105 @@
           <w:p/>
         </w:tc>
       </w:tr>
-      <w:tr>
-        <w:tc>
-          <w:tcPr>
-            <w:tcW w:w="2207" w:type="dxa"/>
-          </w:tcPr>
-          <w:p>
-            <w:r>
-              <w:t>Código del libro</w:t>
-            </w:r>
-          </w:p>
-        </w:tc>
-        <w:tc>
-          <w:tcPr>
-            <w:tcW w:w="2207" w:type="dxa"/>
-          </w:tcPr>
-          <w:p>
-            <w:proofErr w:type="spellStart"/>
-            <w:r>
-              <w:t>Int</w:t>
-            </w:r>
-            <w:proofErr w:type="spellEnd"/>
-          </w:p>
-        </w:tc>
-        <w:tc>
-          <w:tcPr>
-            <w:tcW w:w="2207" w:type="dxa"/>
-          </w:tcPr>
-          <w:p>
-            <w:r>
-              <w:t>200</w:t>
-            </w:r>
-          </w:p>
-        </w:tc>
-        <w:tc>
-          <w:tcPr>
-            <w:tcW w:w="2207" w:type="dxa"/>
-          </w:tcPr>
-          <w:p>
-            <w:r>
-              <w:t>FK</w:t>
-            </w:r>
-          </w:p>
-        </w:tc>
-      </w:tr>
     </w:tbl>
     <w:p/>
     <w:p>
       <w:pPr>
         <w:pStyle w:val="Ttulo3"/>
       </w:pPr>
-      <w:bookmarkStart w:id="3" w:name="_Toc232575964"/>
-      <w:r>
-        <w:t>Entidad: libro</w:t>
-      </w:r>
-      <w:bookmarkEnd w:id="3"/>
+      <w:r>
+        <w:t>Entidad intermedia: escribe</w:t>
+      </w:r>
     </w:p>
     <w:p>
       <w:pPr>
         <w:pStyle w:val="Prrafodelista"/>
         <w:numPr>
           <w:ilvl w:val="0"/>
-          <w:numId w:val="10"/>
+          <w:numId w:val="19"/>
         </w:numPr>
       </w:pPr>
       <w:r>
-        <w:t>Llave primaria (PK) código</w:t>
-      </w:r>
+        <w:t xml:space="preserve">Llaves primarias (PK) </w:t>
+      </w:r>
+      <w:proofErr w:type="spellStart"/>
+      <w:r>
+        <w:t>Código_Autor</w:t>
+      </w:r>
+      <w:proofErr w:type="spellEnd"/>
     </w:p>
     <w:p>
       <w:pPr>
         <w:pStyle w:val="Prrafodelista"/>
         <w:numPr>
           <w:ilvl w:val="0"/>
-          <w:numId w:val="10"/>
+          <w:numId w:val="19"/>
         </w:numPr>
       </w:pPr>
       <w:r>
-        <w:t>Atributo simple titulo</w:t>
-      </w:r>
+        <w:t>Llaves primarias</w:t>
+      </w:r>
+      <w:r>
+        <w:t xml:space="preserve"> (PK)</w:t>
+      </w:r>
+      <w:r>
+        <w:t xml:space="preserve"> </w:t>
+      </w:r>
+      <w:proofErr w:type="spellStart"/>
+      <w:r>
+        <w:t>Código_Libro</w:t>
+      </w:r>
+      <w:proofErr w:type="spellEnd"/>
     </w:p>
     <w:p>
       <w:pPr>
         <w:pStyle w:val="Prrafodelista"/>
         <w:numPr>
           <w:ilvl w:val="0"/>
-          <w:numId w:val="10"/>
+          <w:numId w:val="19"/>
         </w:numPr>
       </w:pPr>
       <w:r>
-        <w:t xml:space="preserve">Atributo simple paginas </w:t>
-      </w:r>
+        <w:t>Llaves foráneas</w:t>
+      </w:r>
+      <w:r>
+        <w:t xml:space="preserve"> (</w:t>
+      </w:r>
+      <w:r>
+        <w:t>F</w:t>
+      </w:r>
+      <w:r>
+        <w:t xml:space="preserve">K) </w:t>
+      </w:r>
+      <w:proofErr w:type="spellStart"/>
+      <w:r>
+        <w:t>Código_Autor</w:t>
+      </w:r>
+      <w:proofErr w:type="spellEnd"/>
     </w:p>
     <w:p>
       <w:pPr>
         <w:pStyle w:val="Prrafodelista"/>
         <w:numPr>
           <w:ilvl w:val="0"/>
-          <w:numId w:val="10"/>
+          <w:numId w:val="19"/>
         </w:numPr>
       </w:pPr>
       <w:r>
-        <w:t>Atributo simple ISBN</w:t>
-      </w:r>
-    </w:p>
-    <w:p>
-      <w:pPr>
-        <w:pStyle w:val="Prrafodelista"/>
-        <w:numPr>
-          <w:ilvl w:val="0"/>
-          <w:numId w:val="10"/>
-        </w:numPr>
-      </w:pPr>
-      <w:r>
-        <w:t>Atributo simple editorial</w:t>
-      </w:r>
-    </w:p>
-    <w:p>
-      <w:pPr>
-        <w:pStyle w:val="Prrafodelista"/>
-        <w:numPr>
-          <w:ilvl w:val="0"/>
-          <w:numId w:val="10"/>
-        </w:numPr>
-      </w:pPr>
-      <w:r>
-        <w:t xml:space="preserve">Llave </w:t>
+        <w:t>Llaves foráneas</w:t>
+      </w:r>
+      <w:r>
+        <w:t xml:space="preserve"> (</w:t>
+      </w:r>
+      <w:r>
+        <w:t>FK</w:t>
+      </w:r>
+      <w:r>
+        <w:t xml:space="preserve">) </w:t>
       </w:r>
       <w:proofErr w:type="spellStart"/>
       <w:r>
-        <w:t>foranea</w:t>
-      </w:r>
-      <w:proofErr w:type="spellEnd"/>
-      <w:r>
-        <w:t xml:space="preserve"> (FK) </w:t>
-      </w:r>
-      <w:proofErr w:type="spellStart"/>
-      <w:r>
-        <w:t>codigoEjemplar</w:t>
+        <w:t>Código_Libro</w:t>
       </w:r>
       <w:proofErr w:type="spellEnd"/>
     </w:p>
@@ -2213,7 +2167,7 @@
           <w:p>
             <w:proofErr w:type="spellStart"/>
             <w:r>
-              <w:t>Codigo</w:t>
+              <w:t>Código_Autor</w:t>
             </w:r>
             <w:proofErr w:type="spellEnd"/>
           </w:p>
@@ -2246,7 +2200,7 @@
           </w:tcPr>
           <w:p>
             <w:r>
-              <w:t>PK</w:t>
+              <w:t>PK/FK</w:t>
             </w:r>
           </w:p>
         </w:tc>
@@ -2257,19 +2211,9 @@
             <w:tcW w:w="2207" w:type="dxa"/>
           </w:tcPr>
           <w:p>
-            <w:r>
-              <w:t>Titulo</w:t>
-            </w:r>
-          </w:p>
-        </w:tc>
-        <w:tc>
-          <w:tcPr>
-            <w:tcW w:w="2207" w:type="dxa"/>
-          </w:tcPr>
-          <w:p>
             <w:proofErr w:type="spellStart"/>
             <w:r>
-              <w:t>Varchar</w:t>
+              <w:t>Código_Libro</w:t>
             </w:r>
             <w:proofErr w:type="spellEnd"/>
           </w:p>
@@ -2279,6 +2223,18 @@
             <w:tcW w:w="2207" w:type="dxa"/>
           </w:tcPr>
           <w:p>
+            <w:proofErr w:type="spellStart"/>
+            <w:r>
+              <w:t>int</w:t>
+            </w:r>
+            <w:proofErr w:type="spellEnd"/>
+          </w:p>
+        </w:tc>
+        <w:tc>
+          <w:tcPr>
+            <w:tcW w:w="2207" w:type="dxa"/>
+          </w:tcPr>
+          <w:p>
             <w:r>
               <w:t>200</w:t>
             </w:r>
@@ -2288,169 +2244,9 @@
           <w:tcPr>
             <w:tcW w:w="2207" w:type="dxa"/>
           </w:tcPr>
-          <w:p/>
-        </w:tc>
-      </w:tr>
-      <w:tr>
-        <w:tc>
-          <w:tcPr>
-            <w:tcW w:w="2207" w:type="dxa"/>
-          </w:tcPr>
-          <w:p>
-            <w:r>
-              <w:t>Pagina</w:t>
-            </w:r>
-          </w:p>
-        </w:tc>
-        <w:tc>
-          <w:tcPr>
-            <w:tcW w:w="2207" w:type="dxa"/>
-          </w:tcPr>
-          <w:p>
-            <w:proofErr w:type="spellStart"/>
-            <w:r>
-              <w:t>Varchar</w:t>
-            </w:r>
-            <w:proofErr w:type="spellEnd"/>
-          </w:p>
-        </w:tc>
-        <w:tc>
-          <w:tcPr>
-            <w:tcW w:w="2207" w:type="dxa"/>
-          </w:tcPr>
-          <w:p>
-            <w:r>
-              <w:t>200</w:t>
-            </w:r>
-          </w:p>
-        </w:tc>
-        <w:tc>
-          <w:tcPr>
-            <w:tcW w:w="2207" w:type="dxa"/>
-          </w:tcPr>
-          <w:p/>
-        </w:tc>
-      </w:tr>
-      <w:tr>
-        <w:tc>
-          <w:tcPr>
-            <w:tcW w:w="2207" w:type="dxa"/>
-          </w:tcPr>
-          <w:p>
-            <w:r>
-              <w:t>ISBN</w:t>
-            </w:r>
-          </w:p>
-        </w:tc>
-        <w:tc>
-          <w:tcPr>
-            <w:tcW w:w="2207" w:type="dxa"/>
-          </w:tcPr>
-          <w:p>
-            <w:proofErr w:type="spellStart"/>
-            <w:r>
-              <w:t>Varchar</w:t>
-            </w:r>
-            <w:proofErr w:type="spellEnd"/>
-          </w:p>
-        </w:tc>
-        <w:tc>
-          <w:tcPr>
-            <w:tcW w:w="2207" w:type="dxa"/>
-          </w:tcPr>
-          <w:p>
-            <w:r>
-              <w:t>200</w:t>
-            </w:r>
-          </w:p>
-        </w:tc>
-        <w:tc>
-          <w:tcPr>
-            <w:tcW w:w="2207" w:type="dxa"/>
-          </w:tcPr>
-          <w:p/>
-        </w:tc>
-      </w:tr>
-      <w:tr>
-        <w:tc>
-          <w:tcPr>
-            <w:tcW w:w="2207" w:type="dxa"/>
-          </w:tcPr>
-          <w:p>
-            <w:r>
-              <w:t>editorial</w:t>
-            </w:r>
-          </w:p>
-        </w:tc>
-        <w:tc>
-          <w:tcPr>
-            <w:tcW w:w="2207" w:type="dxa"/>
-          </w:tcPr>
-          <w:p>
-            <w:proofErr w:type="spellStart"/>
-            <w:r>
-              <w:t>Varchar</w:t>
-            </w:r>
-            <w:proofErr w:type="spellEnd"/>
-          </w:p>
-        </w:tc>
-        <w:tc>
-          <w:tcPr>
-            <w:tcW w:w="2207" w:type="dxa"/>
-          </w:tcPr>
-          <w:p>
-            <w:r>
-              <w:t>200</w:t>
-            </w:r>
-          </w:p>
-        </w:tc>
-        <w:tc>
-          <w:tcPr>
-            <w:tcW w:w="2207" w:type="dxa"/>
-          </w:tcPr>
-          <w:p/>
-        </w:tc>
-      </w:tr>
-      <w:tr>
-        <w:tc>
-          <w:tcPr>
-            <w:tcW w:w="2207" w:type="dxa"/>
-          </w:tcPr>
-          <w:p>
-            <w:r>
-              <w:t>Código ejemplar</w:t>
-            </w:r>
-          </w:p>
-        </w:tc>
-        <w:tc>
-          <w:tcPr>
-            <w:tcW w:w="2207" w:type="dxa"/>
-          </w:tcPr>
-          <w:p>
-            <w:proofErr w:type="spellStart"/>
-            <w:r>
-              <w:t>Int</w:t>
-            </w:r>
-            <w:proofErr w:type="spellEnd"/>
-          </w:p>
-        </w:tc>
-        <w:tc>
-          <w:tcPr>
-            <w:tcW w:w="2207" w:type="dxa"/>
-          </w:tcPr>
-          <w:p>
-            <w:r>
-              <w:t>200</w:t>
-            </w:r>
-          </w:p>
-        </w:tc>
-        <w:tc>
-          <w:tcPr>
-            <w:tcW w:w="2207" w:type="dxa"/>
-          </w:tcPr>
-          <w:p>
-            <w:r>
-              <w:t>FK</w:t>
+          <w:p>
+            <w:r>
+              <w:t>PK/FK</w:t>
             </w:r>
           </w:p>
         </w:tc>
@@ -2461,18 +2257,18 @@
       <w:pPr>
         <w:pStyle w:val="Ttulo3"/>
       </w:pPr>
-      <w:bookmarkStart w:id="4" w:name="_Toc232575965"/>
-      <w:r>
-        <w:t>Entidad: ejemplar</w:t>
-      </w:r>
-      <w:bookmarkEnd w:id="4"/>
+      <w:bookmarkStart w:id="3" w:name="_Toc232575964"/>
+      <w:r>
+        <w:t>Entidad: libro</w:t>
+      </w:r>
+      <w:bookmarkEnd w:id="3"/>
     </w:p>
     <w:p>
       <w:pPr>
         <w:pStyle w:val="Prrafodelista"/>
         <w:numPr>
           <w:ilvl w:val="0"/>
-          <w:numId w:val="11"/>
+          <w:numId w:val="10"/>
         </w:numPr>
       </w:pPr>
       <w:r>
@@ -2484,12 +2280,73 @@
         <w:pStyle w:val="Prrafodelista"/>
         <w:numPr>
           <w:ilvl w:val="0"/>
-          <w:numId w:val="11"/>
+          <w:numId w:val="10"/>
         </w:numPr>
       </w:pPr>
       <w:r>
-        <w:t xml:space="preserve">Atributo simple localización </w:t>
-      </w:r>
+        <w:t>Atributo simple titulo</w:t>
+      </w:r>
+    </w:p>
+    <w:p>
+      <w:pPr>
+        <w:pStyle w:val="Prrafodelista"/>
+        <w:numPr>
+          <w:ilvl w:val="0"/>
+          <w:numId w:val="10"/>
+        </w:numPr>
+      </w:pPr>
+      <w:r>
+        <w:t xml:space="preserve">Atributo simple paginas </w:t>
+      </w:r>
+    </w:p>
+    <w:p>
+      <w:pPr>
+        <w:pStyle w:val="Prrafodelista"/>
+        <w:numPr>
+          <w:ilvl w:val="0"/>
+          <w:numId w:val="10"/>
+        </w:numPr>
+      </w:pPr>
+      <w:r>
+        <w:t>Atributo simple ISBN</w:t>
+      </w:r>
+    </w:p>
+    <w:p>
+      <w:pPr>
+        <w:pStyle w:val="Prrafodelista"/>
+        <w:numPr>
+          <w:ilvl w:val="0"/>
+          <w:numId w:val="10"/>
+        </w:numPr>
+      </w:pPr>
+      <w:r>
+        <w:t>Atributo simple editorial</w:t>
+      </w:r>
+    </w:p>
+    <w:p>
+      <w:pPr>
+        <w:pStyle w:val="Prrafodelista"/>
+        <w:numPr>
+          <w:ilvl w:val="0"/>
+          <w:numId w:val="10"/>
+        </w:numPr>
+      </w:pPr>
+      <w:r>
+        <w:t xml:space="preserve">Llave </w:t>
+      </w:r>
+      <w:proofErr w:type="spellStart"/>
+      <w:r>
+        <w:t>foranea</w:t>
+      </w:r>
+      <w:proofErr w:type="spellEnd"/>
+      <w:r>
+        <w:t xml:space="preserve"> (FK) </w:t>
+      </w:r>
+      <w:proofErr w:type="spellStart"/>
+      <w:r>
+        <w:t>codigoEjemplar</w:t>
+      </w:r>
+      <w:proofErr w:type="spellEnd"/>
     </w:p>
     <w:tbl>
       <w:tblPr>
@@ -2600,9 +2457,11 @@
             <w:tcW w:w="2207" w:type="dxa"/>
           </w:tcPr>
           <w:p>
-            <w:r>
-              <w:t>Código</w:t>
-            </w:r>
+            <w:proofErr w:type="spellStart"/>
+            <w:r>
+              <w:t>Codigo</w:t>
+            </w:r>
+            <w:proofErr w:type="spellEnd"/>
           </w:p>
         </w:tc>
         <w:tc>
@@ -2645,7 +2504,7 @@
           </w:tcPr>
           <w:p>
             <w:r>
-              <w:t>Localización</w:t>
+              <w:t>Titulo</w:t>
             </w:r>
           </w:p>
         </w:tc>
@@ -2656,7 +2515,7 @@
           <w:p>
             <w:proofErr w:type="spellStart"/>
             <w:r>
-              <w:t>Int</w:t>
+              <w:t>Varchar</w:t>
             </w:r>
             <w:proofErr w:type="spellEnd"/>
           </w:p>
@@ -2684,9 +2543,19 @@
             <w:tcW w:w="2207" w:type="dxa"/>
           </w:tcPr>
           <w:p>
+            <w:r>
+              <w:t>Pagina</w:t>
+            </w:r>
+          </w:p>
+        </w:tc>
+        <w:tc>
+          <w:tcPr>
+            <w:tcW w:w="2207" w:type="dxa"/>
+          </w:tcPr>
+          <w:p>
             <w:proofErr w:type="spellStart"/>
             <w:r>
-              <w:t>CodigoSacar</w:t>
+              <w:t>Varchar</w:t>
             </w:r>
             <w:proofErr w:type="spellEnd"/>
           </w:p>
@@ -2696,9 +2565,37 @@
             <w:tcW w:w="2207" w:type="dxa"/>
           </w:tcPr>
           <w:p>
+            <w:r>
+              <w:t>200</w:t>
+            </w:r>
+          </w:p>
+        </w:tc>
+        <w:tc>
+          <w:tcPr>
+            <w:tcW w:w="2207" w:type="dxa"/>
+          </w:tcPr>
+          <w:p/>
+        </w:tc>
+      </w:tr>
+      <w:tr>
+        <w:tc>
+          <w:tcPr>
+            <w:tcW w:w="2207" w:type="dxa"/>
+          </w:tcPr>
+          <w:p>
+            <w:r>
+              <w:t>ISBN</w:t>
+            </w:r>
+          </w:p>
+        </w:tc>
+        <w:tc>
+          <w:tcPr>
+            <w:tcW w:w="2207" w:type="dxa"/>
+          </w:tcPr>
+          <w:p>
             <w:proofErr w:type="spellStart"/>
             <w:r>
-              <w:t>int</w:t>
+              <w:t>Varchar</w:t>
             </w:r>
             <w:proofErr w:type="spellEnd"/>
           </w:p>
@@ -2717,11 +2614,47 @@
           <w:tcPr>
             <w:tcW w:w="2207" w:type="dxa"/>
           </w:tcPr>
-          <w:p>
-            <w:r>
-              <w:t>FK</w:t>
-            </w:r>
-          </w:p>
+          <w:p/>
+        </w:tc>
+      </w:tr>
+      <w:tr>
+        <w:tc>
+          <w:tcPr>
+            <w:tcW w:w="2207" w:type="dxa"/>
+          </w:tcPr>
+          <w:p>
+            <w:r>
+              <w:t>editorial</w:t>
+            </w:r>
+          </w:p>
+        </w:tc>
+        <w:tc>
+          <w:tcPr>
+            <w:tcW w:w="2207" w:type="dxa"/>
+          </w:tcPr>
+          <w:p>
+            <w:proofErr w:type="spellStart"/>
+            <w:r>
+              <w:t>Varchar</w:t>
+            </w:r>
+            <w:proofErr w:type="spellEnd"/>
+          </w:p>
+        </w:tc>
+        <w:tc>
+          <w:tcPr>
+            <w:tcW w:w="2207" w:type="dxa"/>
+          </w:tcPr>
+          <w:p>
+            <w:r>
+              <w:t>200</w:t>
+            </w:r>
+          </w:p>
+        </w:tc>
+        <w:tc>
+          <w:tcPr>
+            <w:tcW w:w="2207" w:type="dxa"/>
+          </w:tcPr>
+          <w:p/>
         </w:tc>
       </w:tr>
     </w:tbl>
@@ -2730,120 +2663,35 @@
       <w:pPr>
         <w:pStyle w:val="Ttulo3"/>
       </w:pPr>
-      <w:bookmarkStart w:id="5" w:name="_Toc232575966"/>
-      <w:r>
-        <w:t>Entidad intermedia saca</w:t>
-      </w:r>
-      <w:bookmarkEnd w:id="5"/>
+      <w:bookmarkStart w:id="4" w:name="_Toc232575965"/>
+      <w:r>
+        <w:t>Entidad: ejemplar</w:t>
+      </w:r>
+      <w:bookmarkEnd w:id="4"/>
     </w:p>
     <w:p>
       <w:pPr>
         <w:pStyle w:val="Prrafodelista"/>
         <w:numPr>
           <w:ilvl w:val="0"/>
-          <w:numId w:val="12"/>
+          <w:numId w:val="11"/>
         </w:numPr>
       </w:pPr>
       <w:r>
-        <w:t xml:space="preserve">Llave primaria (PK) </w:t>
-      </w:r>
-      <w:proofErr w:type="spellStart"/>
-      <w:r>
-        <w:t>codigoSacar</w:t>
-      </w:r>
-      <w:proofErr w:type="spellEnd"/>
+        <w:t>Llave primaria (PK) código</w:t>
+      </w:r>
     </w:p>
     <w:p>
       <w:pPr>
         <w:pStyle w:val="Prrafodelista"/>
         <w:numPr>
           <w:ilvl w:val="0"/>
-          <w:numId w:val="12"/>
+          <w:numId w:val="11"/>
         </w:numPr>
       </w:pPr>
       <w:r>
-        <w:t xml:space="preserve">Llave </w:t>
-      </w:r>
-      <w:proofErr w:type="spellStart"/>
-      <w:r>
-        <w:t>foranea</w:t>
-      </w:r>
-      <w:proofErr w:type="spellEnd"/>
-      <w:r>
-        <w:t xml:space="preserve"> (FK) </w:t>
-      </w:r>
-      <w:proofErr w:type="spellStart"/>
-      <w:r>
-        <w:t>códigoEjemplar</w:t>
-      </w:r>
-      <w:proofErr w:type="spellEnd"/>
-    </w:p>
-    <w:p>
-      <w:pPr>
-        <w:pStyle w:val="Prrafodelista"/>
-        <w:numPr>
-          <w:ilvl w:val="0"/>
-          <w:numId w:val="12"/>
-        </w:numPr>
-      </w:pPr>
-      <w:r>
-        <w:t xml:space="preserve">Llave </w:t>
-      </w:r>
-      <w:proofErr w:type="spellStart"/>
-      <w:proofErr w:type="gramStart"/>
-      <w:r>
-        <w:t>foranea</w:t>
-      </w:r>
-      <w:proofErr w:type="spellEnd"/>
-      <w:r>
-        <w:t>(</w:t>
-      </w:r>
-      <w:proofErr w:type="gramEnd"/>
-      <w:r>
-        <w:t xml:space="preserve">FK) </w:t>
-      </w:r>
-      <w:proofErr w:type="spellStart"/>
-      <w:r>
-        <w:t>codigoUsuario</w:t>
-      </w:r>
-      <w:proofErr w:type="spellEnd"/>
-    </w:p>
-    <w:p>
-      <w:pPr>
-        <w:pStyle w:val="Prrafodelista"/>
-        <w:numPr>
-          <w:ilvl w:val="0"/>
-          <w:numId w:val="12"/>
-        </w:numPr>
-      </w:pPr>
-      <w:r>
-        <w:t xml:space="preserve">Atributo simple </w:t>
-      </w:r>
-      <w:proofErr w:type="spellStart"/>
-      <w:r>
-        <w:t>fechaDev</w:t>
-      </w:r>
-      <w:proofErr w:type="spellEnd"/>
-      <w:r>
-        <w:tab/>
-      </w:r>
-    </w:p>
-    <w:p>
-      <w:pPr>
-        <w:pStyle w:val="Prrafodelista"/>
-        <w:numPr>
-          <w:ilvl w:val="0"/>
-          <w:numId w:val="12"/>
-        </w:numPr>
-      </w:pPr>
-      <w:r>
-        <w:t xml:space="preserve">Atributo simple </w:t>
-      </w:r>
-      <w:proofErr w:type="spellStart"/>
-      <w:r>
-        <w:t>fechaPres</w:t>
-      </w:r>
-      <w:proofErr w:type="spellEnd"/>
+        <w:t xml:space="preserve">Atributo simple localización </w:t>
+      </w:r>
     </w:p>
     <w:tbl>
       <w:tblPr>
@@ -2894,7 +2742,7 @@
                 <w:b/>
                 <w:bCs/>
               </w:rPr>
-              <w:t>tipo</w:t>
+              <w:t>Tipo</w:t>
             </w:r>
           </w:p>
         </w:tc>
@@ -2954,11 +2802,9 @@
             <w:tcW w:w="2207" w:type="dxa"/>
           </w:tcPr>
           <w:p>
-            <w:proofErr w:type="spellStart"/>
-            <w:r>
-              <w:t>CodigoSacar</w:t>
-            </w:r>
-            <w:proofErr w:type="spellEnd"/>
+            <w:r>
+              <w:t>Código</w:t>
+            </w:r>
           </w:p>
         </w:tc>
         <w:tc>
@@ -3000,9 +2846,19 @@
             <w:tcW w:w="2207" w:type="dxa"/>
           </w:tcPr>
           <w:p>
+            <w:r>
+              <w:t>Localización</w:t>
+            </w:r>
+          </w:p>
+        </w:tc>
+        <w:tc>
+          <w:tcPr>
+            <w:tcW w:w="2207" w:type="dxa"/>
+          </w:tcPr>
+          <w:p>
             <w:proofErr w:type="spellStart"/>
             <w:r>
-              <w:t>codigoEjemplar</w:t>
+              <w:t>Int</w:t>
             </w:r>
             <w:proofErr w:type="spellEnd"/>
           </w:p>
@@ -3012,18 +2868,6 @@
             <w:tcW w:w="2207" w:type="dxa"/>
           </w:tcPr>
           <w:p>
-            <w:proofErr w:type="spellStart"/>
-            <w:r>
-              <w:t>Int</w:t>
-            </w:r>
-            <w:proofErr w:type="spellEnd"/>
-          </w:p>
-        </w:tc>
-        <w:tc>
-          <w:tcPr>
-            <w:tcW w:w="2207" w:type="dxa"/>
-          </w:tcPr>
-          <w:p>
             <w:r>
               <w:t>200</w:t>
             </w:r>
@@ -3033,11 +2877,7 @@
           <w:tcPr>
             <w:tcW w:w="2207" w:type="dxa"/>
           </w:tcPr>
-          <w:p>
-            <w:r>
-              <w:t>FK</w:t>
-            </w:r>
-          </w:p>
+          <w:p/>
         </w:tc>
       </w:tr>
       <w:tr>
@@ -3048,8 +2888,7 @@
           <w:p>
             <w:proofErr w:type="spellStart"/>
             <w:r>
-              <w:lastRenderedPageBreak/>
-              <w:t>codigoUsuario</w:t>
+              <w:t>CodigoSacar</w:t>
             </w:r>
             <w:proofErr w:type="spellEnd"/>
           </w:p>
@@ -3061,7 +2900,7 @@
           <w:p>
             <w:proofErr w:type="spellStart"/>
             <w:r>
-              <w:t>Int</w:t>
+              <w:t>int</w:t>
             </w:r>
             <w:proofErr w:type="spellEnd"/>
           </w:p>
@@ -3085,144 +2924,129 @@
               <w:t>FK</w:t>
             </w:r>
           </w:p>
-        </w:tc>
-      </w:tr>
-      <w:tr>
-        <w:tc>
-          <w:tcPr>
-            <w:tcW w:w="2207" w:type="dxa"/>
-          </w:tcPr>
-          <w:p>
-            <w:proofErr w:type="spellStart"/>
-            <w:r>
-              <w:t>fechaDev</w:t>
-            </w:r>
-            <w:proofErr w:type="spellEnd"/>
-          </w:p>
-        </w:tc>
-        <w:tc>
-          <w:tcPr>
-            <w:tcW w:w="2207" w:type="dxa"/>
-          </w:tcPr>
-          <w:p>
-            <w:r>
-              <w:t>Date</w:t>
-            </w:r>
-          </w:p>
-        </w:tc>
-        <w:tc>
-          <w:tcPr>
-            <w:tcW w:w="2207" w:type="dxa"/>
-          </w:tcPr>
-          <w:p/>
-        </w:tc>
-        <w:tc>
-          <w:tcPr>
-            <w:tcW w:w="2207" w:type="dxa"/>
-          </w:tcPr>
-          <w:p/>
-        </w:tc>
-      </w:tr>
-      <w:tr>
-        <w:tc>
-          <w:tcPr>
-            <w:tcW w:w="2207" w:type="dxa"/>
-          </w:tcPr>
-          <w:p>
-            <w:proofErr w:type="spellStart"/>
-            <w:r>
-              <w:t>fechaPres</w:t>
-            </w:r>
-            <w:proofErr w:type="spellEnd"/>
-          </w:p>
-        </w:tc>
-        <w:tc>
-          <w:tcPr>
-            <w:tcW w:w="2207" w:type="dxa"/>
-          </w:tcPr>
-          <w:p>
-            <w:r>
-              <w:t>Date</w:t>
-            </w:r>
-          </w:p>
-        </w:tc>
-        <w:tc>
-          <w:tcPr>
-            <w:tcW w:w="2207" w:type="dxa"/>
-          </w:tcPr>
-          <w:p/>
-        </w:tc>
-        <w:tc>
-          <w:tcPr>
-            <w:tcW w:w="2207" w:type="dxa"/>
-          </w:tcPr>
-          <w:p/>
         </w:tc>
       </w:tr>
     </w:tbl>
     <w:p/>
-    <w:p/>
     <w:p>
       <w:pPr>
         <w:pStyle w:val="Ttulo3"/>
-        <w:ind w:left="720"/>
-      </w:pPr>
-      <w:bookmarkStart w:id="6" w:name="_Toc232575967"/>
-      <w:r>
-        <w:t>Entidad: usuario</w:t>
-      </w:r>
-      <w:bookmarkEnd w:id="6"/>
+      </w:pPr>
+      <w:bookmarkStart w:id="5" w:name="_Toc232575966"/>
+      <w:r>
+        <w:lastRenderedPageBreak/>
+        <w:t>Entidad intermedia saca</w:t>
+      </w:r>
+      <w:bookmarkEnd w:id="5"/>
     </w:p>
     <w:p>
       <w:pPr>
         <w:pStyle w:val="Prrafodelista"/>
         <w:numPr>
           <w:ilvl w:val="0"/>
-          <w:numId w:val="13"/>
+          <w:numId w:val="12"/>
         </w:numPr>
       </w:pPr>
       <w:r>
-        <w:t>Llave principal (PK) código</w:t>
-      </w:r>
+        <w:t xml:space="preserve">Llave primaria (PK) </w:t>
+      </w:r>
+      <w:proofErr w:type="spellStart"/>
+      <w:r>
+        <w:t>codigoSacar</w:t>
+      </w:r>
+      <w:proofErr w:type="spellEnd"/>
     </w:p>
     <w:p>
       <w:pPr>
         <w:pStyle w:val="Prrafodelista"/>
         <w:numPr>
           <w:ilvl w:val="0"/>
-          <w:numId w:val="13"/>
+          <w:numId w:val="12"/>
         </w:numPr>
       </w:pPr>
       <w:r>
-        <w:t xml:space="preserve">Atributo simple nombre </w:t>
-      </w:r>
+        <w:t xml:space="preserve">Llave </w:t>
+      </w:r>
+      <w:proofErr w:type="spellStart"/>
+      <w:r>
+        <w:t>foranea</w:t>
+      </w:r>
+      <w:proofErr w:type="spellEnd"/>
+      <w:r>
+        <w:t xml:space="preserve"> (FK) </w:t>
+      </w:r>
+      <w:proofErr w:type="spellStart"/>
+      <w:r>
+        <w:t>códigoEjemplar</w:t>
+      </w:r>
+      <w:proofErr w:type="spellEnd"/>
     </w:p>
     <w:p>
       <w:pPr>
         <w:pStyle w:val="Prrafodelista"/>
         <w:numPr>
           <w:ilvl w:val="0"/>
-          <w:numId w:val="13"/>
+          <w:numId w:val="12"/>
         </w:numPr>
       </w:pPr>
       <w:r>
-        <w:t>Atributo simple teléfono</w:t>
-      </w:r>
+        <w:t xml:space="preserve">Llave </w:t>
+      </w:r>
+      <w:proofErr w:type="spellStart"/>
+      <w:proofErr w:type="gramStart"/>
+      <w:r>
+        <w:t>foranea</w:t>
+      </w:r>
+      <w:proofErr w:type="spellEnd"/>
+      <w:r>
+        <w:t>(</w:t>
+      </w:r>
+      <w:proofErr w:type="gramEnd"/>
+      <w:r>
+        <w:t xml:space="preserve">FK) </w:t>
+      </w:r>
+      <w:proofErr w:type="spellStart"/>
+      <w:r>
+        <w:t>codigoUsuario</w:t>
+      </w:r>
+      <w:proofErr w:type="spellEnd"/>
     </w:p>
     <w:p>
       <w:pPr>
         <w:pStyle w:val="Prrafodelista"/>
         <w:numPr>
           <w:ilvl w:val="0"/>
-          <w:numId w:val="13"/>
+          <w:numId w:val="12"/>
         </w:numPr>
       </w:pPr>
       <w:r>
         <w:t xml:space="preserve">Atributo simple </w:t>
       </w:r>
-      <w:r>
-        <w:t>dirección</w:t>
-      </w:r>
+      <w:proofErr w:type="spellStart"/>
+      <w:r>
+        <w:t>fechaDev</w:t>
+      </w:r>
+      <w:proofErr w:type="spellEnd"/>
+      <w:r>
+        <w:tab/>
+      </w:r>
+    </w:p>
+    <w:p>
+      <w:pPr>
+        <w:pStyle w:val="Prrafodelista"/>
+        <w:numPr>
+          <w:ilvl w:val="0"/>
+          <w:numId w:val="12"/>
+        </w:numPr>
+      </w:pPr>
+      <w:r>
+        <w:t xml:space="preserve">Atributo simple </w:t>
+      </w:r>
+      <w:proofErr w:type="spellStart"/>
+      <w:r>
+        <w:t>fechaPres</w:t>
+      </w:r>
+      <w:proofErr w:type="spellEnd"/>
     </w:p>
     <w:tbl>
       <w:tblPr>
@@ -3273,6 +3097,342 @@
                 <w:b/>
                 <w:bCs/>
               </w:rPr>
+              <w:t>tipo</w:t>
+            </w:r>
+          </w:p>
+        </w:tc>
+        <w:tc>
+          <w:tcPr>
+            <w:tcW w:w="2207" w:type="dxa"/>
+          </w:tcPr>
+          <w:p>
+            <w:pPr>
+              <w:rPr>
+                <w:b/>
+                <w:bCs/>
+              </w:rPr>
+            </w:pPr>
+            <w:r>
+              <w:rPr>
+                <w:b/>
+                <w:bCs/>
+              </w:rPr>
+              <w:t>Tamaño</w:t>
+            </w:r>
+          </w:p>
+        </w:tc>
+        <w:tc>
+          <w:tcPr>
+            <w:tcW w:w="2207" w:type="dxa"/>
+          </w:tcPr>
+          <w:p>
+            <w:pPr>
+              <w:rPr>
+                <w:b/>
+                <w:bCs/>
+              </w:rPr>
+            </w:pPr>
+            <w:r>
+              <w:rPr>
+                <w:b/>
+                <w:bCs/>
+              </w:rPr>
+              <w:t xml:space="preserve">Tipo </w:t>
+            </w:r>
+            <w:proofErr w:type="spellStart"/>
+            <w:r>
+              <w:rPr>
+                <w:b/>
+                <w:bCs/>
+              </w:rPr>
+              <w:t>key</w:t>
+            </w:r>
+            <w:proofErr w:type="spellEnd"/>
+          </w:p>
+        </w:tc>
+      </w:tr>
+      <w:tr>
+        <w:tc>
+          <w:tcPr>
+            <w:tcW w:w="2207" w:type="dxa"/>
+          </w:tcPr>
+          <w:p>
+            <w:proofErr w:type="spellStart"/>
+            <w:r>
+              <w:t>codigoEjemplar</w:t>
+            </w:r>
+            <w:proofErr w:type="spellEnd"/>
+          </w:p>
+        </w:tc>
+        <w:tc>
+          <w:tcPr>
+            <w:tcW w:w="2207" w:type="dxa"/>
+          </w:tcPr>
+          <w:p>
+            <w:proofErr w:type="spellStart"/>
+            <w:r>
+              <w:t>Int</w:t>
+            </w:r>
+            <w:proofErr w:type="spellEnd"/>
+          </w:p>
+        </w:tc>
+        <w:tc>
+          <w:tcPr>
+            <w:tcW w:w="2207" w:type="dxa"/>
+          </w:tcPr>
+          <w:p>
+            <w:r>
+              <w:t>200</w:t>
+            </w:r>
+          </w:p>
+        </w:tc>
+        <w:tc>
+          <w:tcPr>
+            <w:tcW w:w="2207" w:type="dxa"/>
+          </w:tcPr>
+          <w:p>
+            <w:r>
+              <w:t>FK</w:t>
+            </w:r>
+          </w:p>
+        </w:tc>
+      </w:tr>
+      <w:tr>
+        <w:tc>
+          <w:tcPr>
+            <w:tcW w:w="2207" w:type="dxa"/>
+          </w:tcPr>
+          <w:p>
+            <w:proofErr w:type="spellStart"/>
+            <w:r>
+              <w:t>codigoUsuario</w:t>
+            </w:r>
+            <w:proofErr w:type="spellEnd"/>
+          </w:p>
+        </w:tc>
+        <w:tc>
+          <w:tcPr>
+            <w:tcW w:w="2207" w:type="dxa"/>
+          </w:tcPr>
+          <w:p>
+            <w:proofErr w:type="spellStart"/>
+            <w:r>
+              <w:t>Int</w:t>
+            </w:r>
+            <w:proofErr w:type="spellEnd"/>
+          </w:p>
+        </w:tc>
+        <w:tc>
+          <w:tcPr>
+            <w:tcW w:w="2207" w:type="dxa"/>
+          </w:tcPr>
+          <w:p>
+            <w:r>
+              <w:t>200</w:t>
+            </w:r>
+          </w:p>
+        </w:tc>
+        <w:tc>
+          <w:tcPr>
+            <w:tcW w:w="2207" w:type="dxa"/>
+          </w:tcPr>
+          <w:p>
+            <w:r>
+              <w:t>FK</w:t>
+            </w:r>
+          </w:p>
+        </w:tc>
+      </w:tr>
+      <w:tr>
+        <w:tc>
+          <w:tcPr>
+            <w:tcW w:w="2207" w:type="dxa"/>
+          </w:tcPr>
+          <w:p>
+            <w:proofErr w:type="spellStart"/>
+            <w:r>
+              <w:t>fechaDev</w:t>
+            </w:r>
+            <w:proofErr w:type="spellEnd"/>
+          </w:p>
+        </w:tc>
+        <w:tc>
+          <w:tcPr>
+            <w:tcW w:w="2207" w:type="dxa"/>
+          </w:tcPr>
+          <w:p>
+            <w:r>
+              <w:t>Date</w:t>
+            </w:r>
+          </w:p>
+        </w:tc>
+        <w:tc>
+          <w:tcPr>
+            <w:tcW w:w="2207" w:type="dxa"/>
+          </w:tcPr>
+          <w:p/>
+        </w:tc>
+        <w:tc>
+          <w:tcPr>
+            <w:tcW w:w="2207" w:type="dxa"/>
+          </w:tcPr>
+          <w:p>
+            <w:r>
+              <w:t>PK</w:t>
+            </w:r>
+          </w:p>
+        </w:tc>
+      </w:tr>
+      <w:tr>
+        <w:tc>
+          <w:tcPr>
+            <w:tcW w:w="2207" w:type="dxa"/>
+          </w:tcPr>
+          <w:p>
+            <w:proofErr w:type="spellStart"/>
+            <w:r>
+              <w:t>fechaPres</w:t>
+            </w:r>
+            <w:proofErr w:type="spellEnd"/>
+          </w:p>
+        </w:tc>
+        <w:tc>
+          <w:tcPr>
+            <w:tcW w:w="2207" w:type="dxa"/>
+          </w:tcPr>
+          <w:p>
+            <w:r>
+              <w:t>Date</w:t>
+            </w:r>
+          </w:p>
+        </w:tc>
+        <w:tc>
+          <w:tcPr>
+            <w:tcW w:w="2207" w:type="dxa"/>
+          </w:tcPr>
+          <w:p/>
+        </w:tc>
+        <w:tc>
+          <w:tcPr>
+            <w:tcW w:w="2207" w:type="dxa"/>
+          </w:tcPr>
+          <w:p/>
+        </w:tc>
+      </w:tr>
+    </w:tbl>
+    <w:p/>
+    <w:p/>
+    <w:p>
+      <w:pPr>
+        <w:pStyle w:val="Ttulo3"/>
+        <w:ind w:left="720"/>
+      </w:pPr>
+      <w:bookmarkStart w:id="6" w:name="_Toc232575967"/>
+      <w:r>
+        <w:t>Entidad: usuario</w:t>
+      </w:r>
+      <w:bookmarkEnd w:id="6"/>
+    </w:p>
+    <w:p>
+      <w:pPr>
+        <w:pStyle w:val="Prrafodelista"/>
+        <w:numPr>
+          <w:ilvl w:val="0"/>
+          <w:numId w:val="13"/>
+        </w:numPr>
+      </w:pPr>
+      <w:r>
+        <w:t>Llave principal (PK) código</w:t>
+      </w:r>
+    </w:p>
+    <w:p>
+      <w:pPr>
+        <w:pStyle w:val="Prrafodelista"/>
+        <w:numPr>
+          <w:ilvl w:val="0"/>
+          <w:numId w:val="13"/>
+        </w:numPr>
+      </w:pPr>
+      <w:r>
+        <w:t xml:space="preserve">Atributo simple nombre </w:t>
+      </w:r>
+    </w:p>
+    <w:p>
+      <w:pPr>
+        <w:pStyle w:val="Prrafodelista"/>
+        <w:numPr>
+          <w:ilvl w:val="0"/>
+          <w:numId w:val="13"/>
+        </w:numPr>
+      </w:pPr>
+      <w:r>
+        <w:t>Atributo simple teléfono</w:t>
+      </w:r>
+    </w:p>
+    <w:p>
+      <w:pPr>
+        <w:pStyle w:val="Prrafodelista"/>
+        <w:numPr>
+          <w:ilvl w:val="0"/>
+          <w:numId w:val="13"/>
+        </w:numPr>
+      </w:pPr>
+      <w:r>
+        <w:t xml:space="preserve">Atributo simple </w:t>
+      </w:r>
+      <w:r>
+        <w:t>dirección</w:t>
+      </w:r>
+    </w:p>
+    <w:tbl>
+      <w:tblPr>
+        <w:tblStyle w:val="Tablaconcuadrcula"/>
+        <w:tblW w:w="0" w:type="auto"/>
+        <w:tblLook w:val="04A0" w:firstRow="1" w:lastRow="0" w:firstColumn="1" w:lastColumn="0" w:noHBand="0" w:noVBand="1"/>
+      </w:tblPr>
+      <w:tblGrid>
+        <w:gridCol w:w="2207"/>
+        <w:gridCol w:w="2207"/>
+        <w:gridCol w:w="2207"/>
+        <w:gridCol w:w="2207"/>
+      </w:tblGrid>
+      <w:tr>
+        <w:tc>
+          <w:tcPr>
+            <w:tcW w:w="2207" w:type="dxa"/>
+          </w:tcPr>
+          <w:p>
+            <w:pPr>
+              <w:rPr>
+                <w:b/>
+                <w:bCs/>
+              </w:rPr>
+            </w:pPr>
+            <w:r>
+              <w:rPr>
+                <w:b/>
+                <w:bCs/>
+              </w:rPr>
+              <w:t>Campo</w:t>
+            </w:r>
+          </w:p>
+        </w:tc>
+        <w:tc>
+          <w:tcPr>
+            <w:tcW w:w="2207" w:type="dxa"/>
+          </w:tcPr>
+          <w:p>
+            <w:pPr>
+              <w:rPr>
+                <w:b/>
+                <w:bCs/>
+              </w:rPr>
+            </w:pPr>
+            <w:r>
+              <w:rPr>
+                <w:b/>
+                <w:bCs/>
+              </w:rPr>
               <w:t>Tipo</w:t>
             </w:r>
           </w:p>
@@ -3490,11 +3650,15 @@
     </w:tbl>
     <w:p>
       <w:r>
+        <w:rPr>
+          <w:noProof/>
+        </w:rPr>
+        <w:lastRenderedPageBreak/>
         <w:drawing>
-          <wp:inline distT="0" distB="0" distL="0" distR="0" wp14:anchorId="76182F83" wp14:editId="03B139F6">
-            <wp:extent cx="5612130" cy="4444365"/>
-            <wp:effectExtent l="0" t="0" r="7620" b="0"/>
-            <wp:docPr id="408262431" name="Imagen 1"/>
+          <wp:inline distT="0" distB="0" distL="0" distR="0" wp14:anchorId="29E3ECCC" wp14:editId="01D20BDE">
+            <wp:extent cx="5146675" cy="5209540"/>
+            <wp:effectExtent l="0" t="0" r="0" b="0"/>
+            <wp:docPr id="1555938231" name="Imagen 2"/>
             <wp:cNvGraphicFramePr>
               <a:graphicFrameLocks xmlns:a="http://schemas.openxmlformats.org/drawingml/2006/main" noChangeAspect="1"/>
             </wp:cNvGraphicFramePr>
@@ -3502,23 +3666,36 @@
               <a:graphicData uri="http://schemas.openxmlformats.org/drawingml/2006/picture">
                 <pic:pic xmlns:pic="http://schemas.openxmlformats.org/drawingml/2006/picture">
                   <pic:nvPicPr>
-                    <pic:cNvPr id="408262431" name=""/>
-                    <pic:cNvPicPr/>
+                    <pic:cNvPr id="0" name="Picture 2"/>
+                    <pic:cNvPicPr>
+                      <a:picLocks noChangeAspect="1" noChangeArrowheads="1"/>
+                    </pic:cNvPicPr>
                   </pic:nvPicPr>
                   <pic:blipFill>
-                    <a:blip r:embed="rId9"/>
+                    <a:blip r:embed="rId9">
+                      <a:extLst>
+                        <a:ext uri="{28A0092B-C50C-407E-A947-70E740481C1C}">
+                          <a14:useLocalDpi xmlns:a14="http://schemas.microsoft.com/office/drawing/2010/main" val="0"/>
+                        </a:ext>
+                      </a:extLst>
+                    </a:blip>
+                    <a:srcRect/>
                     <a:stretch>
                       <a:fillRect/>
                     </a:stretch>
                   </pic:blipFill>
-                  <pic:spPr>
+                  <pic:spPr bwMode="auto">
                     <a:xfrm>
                       <a:off x="0" y="0"/>
-                      <a:ext cx="5612130" cy="4444365"/>
+                      <a:ext cx="5146675" cy="5209540"/>
                     </a:xfrm>
                     <a:prstGeom prst="rect">
                       <a:avLst/>
                     </a:prstGeom>
+                    <a:noFill/>
+                    <a:ln>
+                      <a:noFill/>
+                    </a:ln>
                   </pic:spPr>
                 </pic:pic>
               </a:graphicData>
@@ -3527,19 +3704,22 @@
         </w:drawing>
       </w:r>
     </w:p>
-    <w:p/>
     <w:p>
       <w:pPr>
         <w:pStyle w:val="Ttulo1"/>
       </w:pPr>
       <w:bookmarkStart w:id="7" w:name="_Toc232575968"/>
       <w:r>
+        <w:lastRenderedPageBreak/>
         <w:t>Base Datos Farmacia</w:t>
       </w:r>
       <w:bookmarkEnd w:id="7"/>
     </w:p>
     <w:p>
       <w:r>
+        <w:rPr>
+          <w:noProof/>
+        </w:rPr>
         <w:drawing>
           <wp:inline distT="0" distB="0" distL="0" distR="0" wp14:anchorId="0B6066CA" wp14:editId="47645E16">
             <wp:extent cx="5612130" cy="3311525"/>
@@ -3980,8 +4160,16 @@
       </w:r>
       <w:proofErr w:type="spellEnd"/>
       <w:r>
-        <w:t xml:space="preserve"> (FK) propietario</w:t>
-      </w:r>
+        <w:t xml:space="preserve"> (FK) </w:t>
+      </w:r>
+      <w:proofErr w:type="spellStart"/>
+      <w:r>
+        <w:t>propietario</w:t>
+      </w:r>
+      <w:r>
+        <w:t>_DNI</w:t>
+      </w:r>
+      <w:proofErr w:type="spellEnd"/>
     </w:p>
     <w:p>
       <w:pPr>
@@ -3992,7 +4180,6 @@
         </w:numPr>
       </w:pPr>
       <w:r>
-        <w:lastRenderedPageBreak/>
         <w:t xml:space="preserve">Llave </w:t>
       </w:r>
       <w:proofErr w:type="spellStart"/>
@@ -4001,8 +4188,13 @@
       </w:r>
       <w:proofErr w:type="spellEnd"/>
       <w:r>
-        <w:t xml:space="preserve"> (FK) vender</w:t>
-      </w:r>
+        <w:t xml:space="preserve"> (FK) </w:t>
+      </w:r>
+      <w:proofErr w:type="spellStart"/>
+      <w:r>
+        <w:t>Provincia_Ciudad</w:t>
+      </w:r>
+      <w:proofErr w:type="spellEnd"/>
     </w:p>
     <w:p>
       <w:pPr>
@@ -4045,6 +4237,7 @@
                 <w:b/>
                 <w:bCs/>
               </w:rPr>
+              <w:lastRenderedPageBreak/>
               <w:t>Campo</w:t>
             </w:r>
           </w:p>
@@ -4217,9 +4410,14 @@
             <w:tcW w:w="2207" w:type="dxa"/>
           </w:tcPr>
           <w:p>
+            <w:proofErr w:type="spellStart"/>
             <w:r>
               <w:t>Propietario</w:t>
             </w:r>
+            <w:r>
+              <w:t>_DNI</w:t>
+            </w:r>
+            <w:proofErr w:type="spellEnd"/>
           </w:p>
         </w:tc>
         <w:tc>
@@ -4303,9 +4501,11 @@
             <w:tcW w:w="2207" w:type="dxa"/>
           </w:tcPr>
           <w:p>
-            <w:r>
-              <w:t>vender</w:t>
-            </w:r>
+            <w:proofErr w:type="spellStart"/>
+            <w:r>
+              <w:t>Provincia_Ciudad</w:t>
+            </w:r>
+            <w:proofErr w:type="spellEnd"/>
           </w:p>
         </w:tc>
         <w:tc>
@@ -4584,14 +4784,250 @@
           <w:p/>
         </w:tc>
       </w:tr>
+    </w:tbl>
+    <w:p/>
+    <w:p>
+      <w:pPr>
+        <w:pStyle w:val="Ttulo3"/>
+      </w:pPr>
+      <w:r>
+        <w:t xml:space="preserve">Entidad: </w:t>
+      </w:r>
+      <w:proofErr w:type="spellStart"/>
+      <w:r>
+        <w:t>medicamento_monodroga</w:t>
+      </w:r>
+      <w:proofErr w:type="spellEnd"/>
+    </w:p>
+    <w:p>
+      <w:pPr>
+        <w:pStyle w:val="Prrafodelista"/>
+        <w:numPr>
+          <w:ilvl w:val="0"/>
+          <w:numId w:val="17"/>
+        </w:numPr>
+      </w:pPr>
+      <w:r>
+        <w:t xml:space="preserve">Llave primaria (PK) </w:t>
+      </w:r>
+      <w:proofErr w:type="spellStart"/>
+      <w:r>
+        <w:t>Monodroga</w:t>
+      </w:r>
+      <w:proofErr w:type="spellEnd"/>
+    </w:p>
+    <w:p>
+      <w:pPr>
+        <w:pStyle w:val="Prrafodelista"/>
+        <w:numPr>
+          <w:ilvl w:val="0"/>
+          <w:numId w:val="17"/>
+        </w:numPr>
+      </w:pPr>
+      <w:r>
+        <w:t>Llave primaria (PK)</w:t>
+      </w:r>
+      <w:r>
+        <w:t xml:space="preserve"> </w:t>
+      </w:r>
+      <w:proofErr w:type="spellStart"/>
+      <w:r>
+        <w:t>Id_medicamento</w:t>
+      </w:r>
+      <w:proofErr w:type="spellEnd"/>
+    </w:p>
+    <w:p>
+      <w:pPr>
+        <w:pStyle w:val="Prrafodelista"/>
+        <w:numPr>
+          <w:ilvl w:val="0"/>
+          <w:numId w:val="17"/>
+        </w:numPr>
+      </w:pPr>
+      <w:r>
+        <w:t xml:space="preserve">Llave </w:t>
+      </w:r>
+      <w:r>
+        <w:t>foránea</w:t>
+      </w:r>
+      <w:r>
+        <w:t xml:space="preserve"> (</w:t>
+      </w:r>
+      <w:r>
+        <w:t>FK</w:t>
+      </w:r>
+      <w:r>
+        <w:t>)</w:t>
+      </w:r>
+      <w:r>
+        <w:t xml:space="preserve"> </w:t>
+      </w:r>
+      <w:proofErr w:type="spellStart"/>
+      <w:r>
+        <w:t>Id_medicamento</w:t>
+      </w:r>
+      <w:proofErr w:type="spellEnd"/>
+    </w:p>
+    <w:tbl>
+      <w:tblPr>
+        <w:tblStyle w:val="Tablaconcuadrcula"/>
+        <w:tblW w:w="0" w:type="auto"/>
+        <w:tblLook w:val="04A0" w:firstRow="1" w:lastRow="0" w:firstColumn="1" w:lastColumn="0" w:noHBand="0" w:noVBand="1"/>
+      </w:tblPr>
+      <w:tblGrid>
+        <w:gridCol w:w="2268"/>
+        <w:gridCol w:w="2192"/>
+        <w:gridCol w:w="2300"/>
+        <w:gridCol w:w="2068"/>
+      </w:tblGrid>
       <w:tr>
         <w:tc>
           <w:tcPr>
-            <w:tcW w:w="2207" w:type="dxa"/>
-          </w:tcPr>
-          <w:p>
+            <w:tcW w:w="2268" w:type="dxa"/>
+          </w:tcPr>
+          <w:p>
+            <w:pPr>
+              <w:rPr>
+                <w:b/>
+                <w:bCs/>
+              </w:rPr>
+            </w:pPr>
+            <w:r>
+              <w:rPr>
+                <w:b/>
+                <w:bCs/>
+              </w:rPr>
+              <w:t>Campo</w:t>
+            </w:r>
+          </w:p>
+        </w:tc>
+        <w:tc>
+          <w:tcPr>
+            <w:tcW w:w="2192" w:type="dxa"/>
+          </w:tcPr>
+          <w:p>
+            <w:pPr>
+              <w:rPr>
+                <w:b/>
+                <w:bCs/>
+              </w:rPr>
+            </w:pPr>
+            <w:r>
+              <w:rPr>
+                <w:b/>
+                <w:bCs/>
+              </w:rPr>
+              <w:t>Tipo</w:t>
+            </w:r>
+          </w:p>
+        </w:tc>
+        <w:tc>
+          <w:tcPr>
+            <w:tcW w:w="2300" w:type="dxa"/>
+          </w:tcPr>
+          <w:p>
+            <w:pPr>
+              <w:rPr>
+                <w:b/>
+                <w:bCs/>
+              </w:rPr>
+            </w:pPr>
+            <w:r>
+              <w:rPr>
+                <w:b/>
+                <w:bCs/>
+              </w:rPr>
+              <w:t>Tamaño</w:t>
+            </w:r>
+          </w:p>
+        </w:tc>
+        <w:tc>
+          <w:tcPr>
+            <w:tcW w:w="2068" w:type="dxa"/>
+          </w:tcPr>
+          <w:p>
+            <w:pPr>
+              <w:rPr>
+                <w:b/>
+                <w:bCs/>
+              </w:rPr>
+            </w:pPr>
+            <w:r>
+              <w:rPr>
+                <w:b/>
+                <w:bCs/>
+              </w:rPr>
+              <w:t xml:space="preserve">Tipo </w:t>
+            </w:r>
             <w:proofErr w:type="spellStart"/>
             <w:r>
+              <w:rPr>
+                <w:b/>
+                <w:bCs/>
+              </w:rPr>
+              <w:t>key</w:t>
+            </w:r>
+            <w:proofErr w:type="spellEnd"/>
+          </w:p>
+        </w:tc>
+      </w:tr>
+      <w:tr>
+        <w:tc>
+          <w:tcPr>
+            <w:tcW w:w="2268" w:type="dxa"/>
+          </w:tcPr>
+          <w:p>
+            <w:proofErr w:type="spellStart"/>
+            <w:r>
+              <w:t>Id_medicamento</w:t>
+            </w:r>
+            <w:proofErr w:type="spellEnd"/>
+          </w:p>
+        </w:tc>
+        <w:tc>
+          <w:tcPr>
+            <w:tcW w:w="2192" w:type="dxa"/>
+          </w:tcPr>
+          <w:p>
+            <w:proofErr w:type="spellStart"/>
+            <w:r>
+              <w:t>Varchar</w:t>
+            </w:r>
+            <w:proofErr w:type="spellEnd"/>
+            <w:r>
+              <w:t xml:space="preserve"> </w:t>
+            </w:r>
+          </w:p>
+        </w:tc>
+        <w:tc>
+          <w:tcPr>
+            <w:tcW w:w="2300" w:type="dxa"/>
+          </w:tcPr>
+          <w:p>
+            <w:r>
+              <w:t>200</w:t>
+            </w:r>
+          </w:p>
+        </w:tc>
+        <w:tc>
+          <w:tcPr>
+            <w:tcW w:w="2068" w:type="dxa"/>
+          </w:tcPr>
+          <w:p>
+            <w:r>
+              <w:t>PK/FK</w:t>
+            </w:r>
+          </w:p>
+        </w:tc>
+      </w:tr>
+      <w:tr>
+        <w:tc>
+          <w:tcPr>
+            <w:tcW w:w="2268" w:type="dxa"/>
+          </w:tcPr>
+          <w:p>
+            <w:proofErr w:type="spellStart"/>
+            <w:r>
               <w:t>Monodroga</w:t>
             </w:r>
             <w:proofErr w:type="spellEnd"/>
@@ -4599,7 +5035,7 @@
         </w:tc>
         <w:tc>
           <w:tcPr>
-            <w:tcW w:w="2207" w:type="dxa"/>
+            <w:tcW w:w="2192" w:type="dxa"/>
           </w:tcPr>
           <w:p>
             <w:proofErr w:type="spellStart"/>
@@ -4611,7 +5047,7 @@
         </w:tc>
         <w:tc>
           <w:tcPr>
-            <w:tcW w:w="2207" w:type="dxa"/>
+            <w:tcW w:w="2300" w:type="dxa"/>
           </w:tcPr>
           <w:p>
             <w:r>
@@ -4621,15 +5057,16 @@
         </w:tc>
         <w:tc>
           <w:tcPr>
-            <w:tcW w:w="2207" w:type="dxa"/>
-          </w:tcPr>
-          <w:p/>
+            <w:tcW w:w="2068" w:type="dxa"/>
+          </w:tcPr>
+          <w:p>
+            <w:r>
+              <w:t>PK</w:t>
+            </w:r>
+          </w:p>
         </w:tc>
       </w:tr>
     </w:tbl>
-    <w:p/>
-    <w:p/>
-    <w:p/>
     <w:p/>
     <w:p>
       <w:pPr>
@@ -4654,8 +5091,13 @@
         </w:numPr>
       </w:pPr>
       <w:r>
-        <w:t>Llave primaria (PK) vender</w:t>
-      </w:r>
+        <w:t xml:space="preserve">Llave primaria (PK) </w:t>
+      </w:r>
+      <w:proofErr w:type="spellStart"/>
+      <w:r>
+        <w:t>Id_medicamento</w:t>
+      </w:r>
+      <w:proofErr w:type="spellEnd"/>
     </w:p>
     <w:p>
       <w:pPr>
@@ -4666,16 +5108,16 @@
         </w:numPr>
       </w:pPr>
       <w:r>
-        <w:t xml:space="preserve">Llave </w:t>
+        <w:t>Llave primaria (PK)</w:t>
+      </w:r>
+      <w:r>
+        <w:t xml:space="preserve"> </w:t>
       </w:r>
       <w:proofErr w:type="spellStart"/>
       <w:r>
-        <w:t>foranea</w:t>
+        <w:t>NombreFarmacia</w:t>
       </w:r>
       <w:proofErr w:type="spellEnd"/>
-      <w:r>
-        <w:t xml:space="preserve"> (FK) medicamento</w:t>
-      </w:r>
     </w:p>
     <w:p>
       <w:pPr>
@@ -4689,6 +5131,31 @@
         <w:t xml:space="preserve">Llave </w:t>
       </w:r>
       <w:proofErr w:type="spellStart"/>
+      <w:r>
+        <w:t>foranea</w:t>
+      </w:r>
+      <w:proofErr w:type="spellEnd"/>
+      <w:r>
+        <w:t xml:space="preserve"> (FK) </w:t>
+      </w:r>
+      <w:proofErr w:type="spellStart"/>
+      <w:r>
+        <w:t>Id_medicamento</w:t>
+      </w:r>
+      <w:proofErr w:type="spellEnd"/>
+    </w:p>
+    <w:p>
+      <w:pPr>
+        <w:pStyle w:val="Prrafodelista"/>
+        <w:numPr>
+          <w:ilvl w:val="0"/>
+          <w:numId w:val="18"/>
+        </w:numPr>
+      </w:pPr>
+      <w:r>
+        <w:t xml:space="preserve">Llave </w:t>
+      </w:r>
+      <w:proofErr w:type="spellStart"/>
       <w:proofErr w:type="gramStart"/>
       <w:r>
         <w:t>foranea</w:t>
@@ -4699,8 +5166,13 @@
       </w:r>
       <w:proofErr w:type="gramEnd"/>
       <w:r>
-        <w:t>FK) farmacia</w:t>
-      </w:r>
+        <w:t xml:space="preserve">FK) </w:t>
+      </w:r>
+      <w:proofErr w:type="spellStart"/>
+      <w:r>
+        <w:t>NombreFarmacia</w:t>
+      </w:r>
+      <w:proofErr w:type="spellEnd"/>
     </w:p>
     <w:p>
       <w:pPr>
@@ -4831,19 +5303,9 @@
             <w:tcW w:w="2207" w:type="dxa"/>
           </w:tcPr>
           <w:p>
-            <w:r>
-              <w:t>Vender</w:t>
-            </w:r>
-          </w:p>
-        </w:tc>
-        <w:tc>
-          <w:tcPr>
-            <w:tcW w:w="2207" w:type="dxa"/>
-          </w:tcPr>
-          <w:p>
             <w:proofErr w:type="spellStart"/>
             <w:r>
-              <w:t>Float</w:t>
+              <w:t>Id_medicamento</w:t>
             </w:r>
             <w:proofErr w:type="spellEnd"/>
           </w:p>
@@ -4853,6 +5315,18 @@
             <w:tcW w:w="2207" w:type="dxa"/>
           </w:tcPr>
           <w:p>
+            <w:proofErr w:type="spellStart"/>
+            <w:r>
+              <w:t>Varchar</w:t>
+            </w:r>
+            <w:proofErr w:type="spellEnd"/>
+          </w:p>
+        </w:tc>
+        <w:tc>
+          <w:tcPr>
+            <w:tcW w:w="2207" w:type="dxa"/>
+          </w:tcPr>
+          <w:p>
             <w:r>
               <w:t>200</w:t>
             </w:r>
@@ -4864,7 +5338,10 @@
           </w:tcPr>
           <w:p>
             <w:r>
-              <w:t>PK</w:t>
+              <w:t>PK/</w:t>
+            </w:r>
+            <w:r>
+              <w:t>FK</w:t>
             </w:r>
           </w:p>
         </w:tc>
@@ -4875,18 +5352,20 @@
             <w:tcW w:w="2207" w:type="dxa"/>
           </w:tcPr>
           <w:p>
-            <w:r>
-              <w:t>Medicamento</w:t>
-            </w:r>
-          </w:p>
-        </w:tc>
-        <w:tc>
-          <w:tcPr>
-            <w:tcW w:w="2207" w:type="dxa"/>
-          </w:tcPr>
-          <w:p>
             <w:proofErr w:type="spellStart"/>
             <w:r>
+              <w:t>NombreFarmacia</w:t>
+            </w:r>
+            <w:proofErr w:type="spellEnd"/>
+          </w:p>
+        </w:tc>
+        <w:tc>
+          <w:tcPr>
+            <w:tcW w:w="2207" w:type="dxa"/>
+          </w:tcPr>
+          <w:p>
+            <w:proofErr w:type="spellStart"/>
+            <w:r>
               <w:t>Varchar</w:t>
             </w:r>
             <w:proofErr w:type="spellEnd"/>
@@ -4908,49 +5387,8 @@
           </w:tcPr>
           <w:p>
             <w:r>
-              <w:t>FK</w:t>
-            </w:r>
-          </w:p>
-        </w:tc>
-      </w:tr>
-      <w:tr>
-        <w:tc>
-          <w:tcPr>
-            <w:tcW w:w="2207" w:type="dxa"/>
-          </w:tcPr>
-          <w:p>
-            <w:r>
-              <w:t>Farmacia</w:t>
-            </w:r>
-          </w:p>
-        </w:tc>
-        <w:tc>
-          <w:tcPr>
-            <w:tcW w:w="2207" w:type="dxa"/>
-          </w:tcPr>
-          <w:p>
-            <w:proofErr w:type="spellStart"/>
-            <w:r>
-              <w:t>Varchar</w:t>
-            </w:r>
-            <w:proofErr w:type="spellEnd"/>
-          </w:p>
-        </w:tc>
-        <w:tc>
-          <w:tcPr>
-            <w:tcW w:w="2207" w:type="dxa"/>
-          </w:tcPr>
-          <w:p>
-            <w:r>
-              <w:t>200</w:t>
-            </w:r>
-          </w:p>
-        </w:tc>
-        <w:tc>
-          <w:tcPr>
-            <w:tcW w:w="2207" w:type="dxa"/>
-          </w:tcPr>
-          <w:p>
+              <w:t>PK/</w:t>
+            </w:r>
             <w:r>
               <w:t>FK</w:t>
             </w:r>
@@ -5030,6 +5468,7 @@
         </w:numPr>
       </w:pPr>
       <w:r>
+        <w:lastRenderedPageBreak/>
         <w:t>Atributo simple nombre</w:t>
       </w:r>
     </w:p>
@@ -5042,20 +5481,51 @@
         </w:numPr>
       </w:pPr>
       <w:r>
-        <w:lastRenderedPageBreak/>
-        <w:t>Atributo compuesto dirección</w:t>
-      </w:r>
-      <w:r>
-        <w:tab/>
-        <w:t xml:space="preserve">Calle, </w:t>
-      </w:r>
+        <w:t>Atributo compuesto</w:t>
+      </w:r>
+      <w:r>
+        <w:t xml:space="preserve"> dirección:</w:t>
+      </w:r>
+    </w:p>
+    <w:p>
+      <w:pPr>
+        <w:pStyle w:val="Prrafodelista"/>
+        <w:numPr>
+          <w:ilvl w:val="0"/>
+          <w:numId w:val="16"/>
+        </w:numPr>
+      </w:pPr>
+      <w:r>
+        <w:t>Calle</w:t>
+      </w:r>
+    </w:p>
+    <w:p>
+      <w:pPr>
+        <w:pStyle w:val="Prrafodelista"/>
+        <w:numPr>
+          <w:ilvl w:val="0"/>
+          <w:numId w:val="16"/>
+        </w:numPr>
+      </w:pPr>
       <w:proofErr w:type="spellStart"/>
       <w:r>
         <w:t>codigoPostal</w:t>
       </w:r>
       <w:proofErr w:type="spellEnd"/>
       <w:r>
-        <w:t>, ciudad.</w:t>
+        <w:t>,</w:t>
+      </w:r>
+    </w:p>
+    <w:p>
+      <w:pPr>
+        <w:pStyle w:val="Prrafodelista"/>
+        <w:numPr>
+          <w:ilvl w:val="0"/>
+          <w:numId w:val="16"/>
+        </w:numPr>
+      </w:pPr>
+      <w:r>
+        <w:t>ciudad</w:t>
       </w:r>
     </w:p>
     <w:tbl>
@@ -5243,7 +5713,7 @@
           </w:tcPr>
           <w:p>
             <w:r>
-              <w:t>Dirección</w:t>
+              <w:t>Calle</w:t>
             </w:r>
           </w:p>
         </w:tc>
@@ -5282,19 +5752,21 @@
             <w:tcW w:w="2207" w:type="dxa"/>
           </w:tcPr>
           <w:p>
-            <w:r>
-              <w:t>Calle</w:t>
-            </w:r>
-          </w:p>
-        </w:tc>
-        <w:tc>
-          <w:tcPr>
-            <w:tcW w:w="2207" w:type="dxa"/>
-          </w:tcPr>
-          <w:p>
             <w:proofErr w:type="spellStart"/>
             <w:r>
-              <w:t>Varchar</w:t>
+              <w:t>codigoPostal</w:t>
+            </w:r>
+            <w:proofErr w:type="spellEnd"/>
+          </w:p>
+        </w:tc>
+        <w:tc>
+          <w:tcPr>
+            <w:tcW w:w="2207" w:type="dxa"/>
+          </w:tcPr>
+          <w:p>
+            <w:proofErr w:type="spellStart"/>
+            <w:r>
+              <w:t>Int</w:t>
             </w:r>
             <w:proofErr w:type="spellEnd"/>
           </w:p>
@@ -5322,48 +5794,6 @@
             <w:tcW w:w="2207" w:type="dxa"/>
           </w:tcPr>
           <w:p>
-            <w:proofErr w:type="spellStart"/>
-            <w:r>
-              <w:t>codigoPostal</w:t>
-            </w:r>
-            <w:proofErr w:type="spellEnd"/>
-          </w:p>
-        </w:tc>
-        <w:tc>
-          <w:tcPr>
-            <w:tcW w:w="2207" w:type="dxa"/>
-          </w:tcPr>
-          <w:p>
-            <w:proofErr w:type="spellStart"/>
-            <w:r>
-              <w:t>Int</w:t>
-            </w:r>
-            <w:proofErr w:type="spellEnd"/>
-          </w:p>
-        </w:tc>
-        <w:tc>
-          <w:tcPr>
-            <w:tcW w:w="2207" w:type="dxa"/>
-          </w:tcPr>
-          <w:p>
-            <w:r>
-              <w:t>200</w:t>
-            </w:r>
-          </w:p>
-        </w:tc>
-        <w:tc>
-          <w:tcPr>
-            <w:tcW w:w="2207" w:type="dxa"/>
-          </w:tcPr>
-          <w:p/>
-        </w:tc>
-      </w:tr>
-      <w:tr>
-        <w:tc>
-          <w:tcPr>
-            <w:tcW w:w="2207" w:type="dxa"/>
-          </w:tcPr>
-          <w:p>
             <w:r>
               <w:t>Ciudad</w:t>
             </w:r>
@@ -5399,13 +5829,18 @@
         </w:tc>
       </w:tr>
     </w:tbl>
-    <w:p>
-      <w:r>
+    <w:p/>
+    <w:p>
+      <w:r>
+        <w:rPr>
+          <w:noProof/>
+        </w:rPr>
+        <w:lastRenderedPageBreak/>
         <w:drawing>
-          <wp:inline distT="0" distB="0" distL="0" distR="0" wp14:anchorId="7A85A313" wp14:editId="4642180C">
-            <wp:extent cx="5612130" cy="5129530"/>
-            <wp:effectExtent l="0" t="0" r="7620" b="0"/>
-            <wp:docPr id="872504355" name="Imagen 1"/>
+          <wp:inline distT="0" distB="0" distL="0" distR="0" wp14:anchorId="26640DB5" wp14:editId="15C897BB">
+            <wp:extent cx="5610860" cy="5603875"/>
+            <wp:effectExtent l="0" t="0" r="8890" b="0"/>
+            <wp:docPr id="2082138339" name="Imagen 3"/>
             <wp:cNvGraphicFramePr>
               <a:graphicFrameLocks xmlns:a="http://schemas.openxmlformats.org/drawingml/2006/main" noChangeAspect="1"/>
             </wp:cNvGraphicFramePr>
@@ -5413,23 +5848,36 @@
               <a:graphicData uri="http://schemas.openxmlformats.org/drawingml/2006/picture">
                 <pic:pic xmlns:pic="http://schemas.openxmlformats.org/drawingml/2006/picture">
                   <pic:nvPicPr>
-                    <pic:cNvPr id="872504355" name=""/>
-                    <pic:cNvPicPr/>
+                    <pic:cNvPr id="0" name="Picture 3"/>
+                    <pic:cNvPicPr>
+                      <a:picLocks noChangeAspect="1" noChangeArrowheads="1"/>
+                    </pic:cNvPicPr>
                   </pic:nvPicPr>
                   <pic:blipFill>
-                    <a:blip r:embed="rId11"/>
+                    <a:blip r:embed="rId11">
+                      <a:extLst>
+                        <a:ext uri="{28A0092B-C50C-407E-A947-70E740481C1C}">
+                          <a14:useLocalDpi xmlns:a14="http://schemas.microsoft.com/office/drawing/2010/main" val="0"/>
+                        </a:ext>
+                      </a:extLst>
+                    </a:blip>
+                    <a:srcRect/>
                     <a:stretch>
                       <a:fillRect/>
                     </a:stretch>
                   </pic:blipFill>
-                  <pic:spPr>
+                  <pic:spPr bwMode="auto">
                     <a:xfrm>
                       <a:off x="0" y="0"/>
-                      <a:ext cx="5612130" cy="5129530"/>
+                      <a:ext cx="5610860" cy="5603875"/>
                     </a:xfrm>
                     <a:prstGeom prst="rect">
                       <a:avLst/>
                     </a:prstGeom>
+                    <a:noFill/>
+                    <a:ln>
+                      <a:noFill/>
+                    </a:ln>
                   </pic:spPr>
                 </pic:pic>
               </a:graphicData>
@@ -5438,72 +5886,38 @@
         </w:drawing>
       </w:r>
     </w:p>
-    <w:p/>
     <w:p>
       <w:pPr>
         <w:pStyle w:val="Ttulo1"/>
       </w:pPr>
       <w:r>
+        <w:t>Ejercicio Negocio</w:t>
+      </w:r>
+    </w:p>
+    <w:p>
+      <w:r>
+        <w:t xml:space="preserve"> Para este ejercicio, de acuerdo a la imagen anexa, generar el modelo relacional en la herramienta </w:t>
+      </w:r>
+      <w:proofErr w:type="spellStart"/>
+      <w:r>
+        <w:t>mysqlworkbench</w:t>
+      </w:r>
+      <w:proofErr w:type="spellEnd"/>
+      <w:r>
+        <w:t>.</w:t>
+      </w:r>
+    </w:p>
+    <w:p>
+      <w:r>
+        <w:rPr>
+          <w:noProof/>
+        </w:rPr>
         <w:lastRenderedPageBreak/>
-        <w:t>Ejercicio Negocio</w:t>
-      </w:r>
-    </w:p>
-    <w:p>
-      <w:r>
-        <w:t xml:space="preserve"> Para este ejercicio, de acuerdo a la imagen anexa, generar el modelo relacional en la herramienta </w:t>
-      </w:r>
-      <w:proofErr w:type="spellStart"/>
-      <w:r>
-        <w:t>mysqlworkbench</w:t>
-      </w:r>
-      <w:proofErr w:type="spellEnd"/>
-      <w:r>
-        <w:t>.</w:t>
-      </w:r>
-    </w:p>
-    <w:p/>
-    <w:p>
-      <w:pPr>
-        <w:spacing w:after="0" w:line="240" w:lineRule="auto"/>
-        <w:rPr>
-          <w:rFonts w:ascii="Arial" w:hAnsi="Arial" w:cs="Arial"/>
-          <w:sz w:val="28"/>
-          <w:szCs w:val="28"/>
-        </w:rPr>
-      </w:pPr>
-    </w:p>
-    <w:p>
-      <w:pPr>
-        <w:pStyle w:val="Prrafodelista"/>
-        <w:spacing w:after="0" w:line="240" w:lineRule="auto"/>
-        <w:rPr>
-          <w:rFonts w:ascii="Arial" w:hAnsi="Arial" w:cs="Arial"/>
-          <w:sz w:val="24"/>
-          <w:szCs w:val="24"/>
-        </w:rPr>
-      </w:pPr>
-    </w:p>
-    <w:p>
-      <w:pPr>
-        <w:spacing w:after="0" w:line="240" w:lineRule="auto"/>
-        <w:jc w:val="center"/>
-        <w:rPr>
-          <w:rFonts w:ascii="Arial" w:hAnsi="Arial" w:cs="Arial"/>
-          <w:sz w:val="28"/>
-          <w:szCs w:val="28"/>
-        </w:rPr>
-      </w:pPr>
-      <w:r>
-        <w:rPr>
-          <w:rFonts w:ascii="Arial" w:hAnsi="Arial" w:cs="Arial"/>
-          <w:sz w:val="28"/>
-          <w:szCs w:val="28"/>
-        </w:rPr>
         <w:drawing>
-          <wp:inline distT="0" distB="0" distL="0" distR="0" wp14:anchorId="31615143" wp14:editId="7D774B2E">
-            <wp:extent cx="4694327" cy="5159187"/>
-            <wp:effectExtent l="0" t="0" r="0" b="3810"/>
-            <wp:docPr id="151353654" name="Imagen 1"/>
+          <wp:inline distT="0" distB="0" distL="0" distR="0" wp14:anchorId="29128336" wp14:editId="567764FD">
+            <wp:extent cx="5610860" cy="3983355"/>
+            <wp:effectExtent l="0" t="0" r="8890" b="0"/>
+            <wp:docPr id="193541196" name="Imagen 4"/>
             <wp:cNvGraphicFramePr>
               <a:graphicFrameLocks xmlns:a="http://schemas.openxmlformats.org/drawingml/2006/main" noChangeAspect="1"/>
             </wp:cNvGraphicFramePr>
@@ -5511,23 +5925,36 @@
               <a:graphicData uri="http://schemas.openxmlformats.org/drawingml/2006/picture">
                 <pic:pic xmlns:pic="http://schemas.openxmlformats.org/drawingml/2006/picture">
                   <pic:nvPicPr>
-                    <pic:cNvPr id="151353654" name=""/>
-                    <pic:cNvPicPr/>
+                    <pic:cNvPr id="0" name="Picture 4"/>
+                    <pic:cNvPicPr>
+                      <a:picLocks noChangeAspect="1" noChangeArrowheads="1"/>
+                    </pic:cNvPicPr>
                   </pic:nvPicPr>
                   <pic:blipFill>
-                    <a:blip r:embed="rId12"/>
+                    <a:blip r:embed="rId12">
+                      <a:extLst>
+                        <a:ext uri="{28A0092B-C50C-407E-A947-70E740481C1C}">
+                          <a14:useLocalDpi xmlns:a14="http://schemas.microsoft.com/office/drawing/2010/main" val="0"/>
+                        </a:ext>
+                      </a:extLst>
+                    </a:blip>
+                    <a:srcRect/>
                     <a:stretch>
                       <a:fillRect/>
                     </a:stretch>
                   </pic:blipFill>
-                  <pic:spPr>
+                  <pic:spPr bwMode="auto">
                     <a:xfrm>
                       <a:off x="0" y="0"/>
-                      <a:ext cx="4694327" cy="5159187"/>
+                      <a:ext cx="5610860" cy="3983355"/>
                     </a:xfrm>
                     <a:prstGeom prst="rect">
                       <a:avLst/>
                     </a:prstGeom>
+                    <a:noFill/>
+                    <a:ln>
+                      <a:noFill/>
+                    </a:ln>
                   </pic:spPr>
                 </pic:pic>
               </a:graphicData>
@@ -5536,8 +5963,242 @@
         </w:drawing>
       </w:r>
     </w:p>
+    <w:p>
+      <w:pPr>
+        <w:spacing w:after="0" w:line="240" w:lineRule="auto"/>
+        <w:rPr>
+          <w:rFonts w:ascii="Arial" w:hAnsi="Arial" w:cs="Arial"/>
+          <w:sz w:val="28"/>
+          <w:szCs w:val="28"/>
+        </w:rPr>
+      </w:pPr>
+    </w:p>
+    <w:p>
+      <w:pPr>
+        <w:pStyle w:val="Prrafodelista"/>
+        <w:spacing w:after="0" w:line="240" w:lineRule="auto"/>
+        <w:rPr>
+          <w:rFonts w:ascii="Arial" w:hAnsi="Arial" w:cs="Arial"/>
+          <w:sz w:val="24"/>
+          <w:szCs w:val="24"/>
+        </w:rPr>
+      </w:pPr>
+    </w:p>
+    <w:p>
+      <w:pPr>
+        <w:spacing w:after="0" w:line="240" w:lineRule="auto"/>
+        <w:jc w:val="center"/>
+        <w:rPr>
+          <w:rFonts w:ascii="Arial" w:hAnsi="Arial" w:cs="Arial"/>
+          <w:sz w:val="28"/>
+          <w:szCs w:val="28"/>
+        </w:rPr>
+      </w:pPr>
+    </w:p>
+    <w:p>
+      <w:pPr>
+        <w:spacing w:after="0" w:line="240" w:lineRule="auto"/>
+        <w:rPr>
+          <w:rFonts w:ascii="Arial" w:hAnsi="Arial" w:cs="Arial"/>
+          <w:sz w:val="28"/>
+          <w:szCs w:val="28"/>
+        </w:rPr>
+      </w:pPr>
+    </w:p>
+    <w:p>
+      <w:pPr>
+        <w:spacing w:after="0" w:line="240" w:lineRule="auto"/>
+        <w:rPr>
+          <w:rFonts w:ascii="Arial" w:hAnsi="Arial" w:cs="Arial"/>
+          <w:sz w:val="28"/>
+          <w:szCs w:val="28"/>
+        </w:rPr>
+      </w:pPr>
+    </w:p>
+    <w:p>
+      <w:pPr>
+        <w:spacing w:after="0" w:line="240" w:lineRule="auto"/>
+        <w:rPr>
+          <w:rFonts w:ascii="Arial" w:hAnsi="Arial" w:cs="Arial"/>
+          <w:sz w:val="28"/>
+          <w:szCs w:val="28"/>
+        </w:rPr>
+      </w:pPr>
+    </w:p>
+    <w:p>
+      <w:pPr>
+        <w:spacing w:after="0" w:line="240" w:lineRule="auto"/>
+        <w:rPr>
+          <w:rFonts w:ascii="Arial" w:hAnsi="Arial" w:cs="Arial"/>
+          <w:sz w:val="28"/>
+          <w:szCs w:val="28"/>
+        </w:rPr>
+      </w:pPr>
+      <w:r>
+        <w:rPr>
+          <w:rFonts w:ascii="Arial" w:hAnsi="Arial" w:cs="Arial"/>
+          <w:sz w:val="28"/>
+          <w:szCs w:val="28"/>
+        </w:rPr>
+        <w:t xml:space="preserve">Link de la Actividad: </w:t>
+      </w:r>
+      <w:hyperlink r:id="rId13" w:history="1">
+        <w:r>
+          <w:rPr>
+            <w:rStyle w:val="Hipervnculo"/>
+            <w:rFonts w:ascii="Arial" w:hAnsi="Arial" w:cs="Arial"/>
+            <w:sz w:val="28"/>
+            <w:szCs w:val="28"/>
+          </w:rPr>
+          <w:t xml:space="preserve">tercer-Trimestre/Modelo De Base de Datos/Actividad 4 at </w:t>
+        </w:r>
+        <w:proofErr w:type="spellStart"/>
+        <w:r>
+          <w:rPr>
+            <w:rStyle w:val="Hipervnculo"/>
+            <w:rFonts w:ascii="Arial" w:hAnsi="Arial" w:cs="Arial"/>
+            <w:sz w:val="28"/>
+            <w:szCs w:val="28"/>
+          </w:rPr>
+          <w:t>main</w:t>
+        </w:r>
+        <w:proofErr w:type="spellEnd"/>
+        <w:r>
+          <w:rPr>
+            <w:rStyle w:val="Hipervnculo"/>
+            <w:rFonts w:ascii="Arial" w:hAnsi="Arial" w:cs="Arial"/>
+            <w:sz w:val="28"/>
+            <w:szCs w:val="28"/>
+          </w:rPr>
+          <w:t xml:space="preserve"> · erikalegria1999-cmd/tercer-Trimestre</w:t>
+        </w:r>
+      </w:hyperlink>
+    </w:p>
+    <w:p>
+      <w:pPr>
+        <w:spacing w:after="0" w:line="240" w:lineRule="auto"/>
+        <w:rPr>
+          <w:rFonts w:ascii="Arial" w:hAnsi="Arial" w:cs="Arial"/>
+          <w:sz w:val="28"/>
+          <w:szCs w:val="28"/>
+        </w:rPr>
+      </w:pPr>
+      <w:r>
+        <w:rPr>
+          <w:rFonts w:ascii="Arial" w:hAnsi="Arial" w:cs="Arial"/>
+          <w:sz w:val="28"/>
+          <w:szCs w:val="28"/>
+        </w:rPr>
+        <w:t xml:space="preserve">Link del </w:t>
+      </w:r>
+      <w:proofErr w:type="spellStart"/>
+      <w:r>
+        <w:rPr>
+          <w:rFonts w:ascii="Arial" w:hAnsi="Arial" w:cs="Arial"/>
+          <w:sz w:val="28"/>
+          <w:szCs w:val="28"/>
+        </w:rPr>
+        <w:t>Mvb</w:t>
+      </w:r>
+      <w:proofErr w:type="spellEnd"/>
+      <w:r>
+        <w:rPr>
+          <w:rFonts w:ascii="Arial" w:hAnsi="Arial" w:cs="Arial"/>
+          <w:sz w:val="28"/>
+          <w:szCs w:val="28"/>
+        </w:rPr>
+        <w:t>:</w:t>
+      </w:r>
+      <w:r>
+        <w:t xml:space="preserve"> </w:t>
+      </w:r>
+      <w:hyperlink r:id="rId14" w:history="1">
+        <w:r>
+          <w:rPr>
+            <w:rStyle w:val="Hipervnculo"/>
+            <w:rFonts w:ascii="Arial" w:hAnsi="Arial" w:cs="Arial"/>
+            <w:sz w:val="28"/>
+            <w:szCs w:val="28"/>
+          </w:rPr>
+          <w:t>tercer-Trimestre/Modelo De Base de Datos/Actividad 4/</w:t>
+        </w:r>
+        <w:proofErr w:type="spellStart"/>
+        <w:r>
+          <w:rPr>
+            <w:rStyle w:val="Hipervnculo"/>
+            <w:rFonts w:ascii="Arial" w:hAnsi="Arial" w:cs="Arial"/>
+            <w:sz w:val="28"/>
+            <w:szCs w:val="28"/>
+          </w:rPr>
+          <w:t>MySQLWorkbench</w:t>
+        </w:r>
+        <w:proofErr w:type="spellEnd"/>
+        <w:r>
+          <w:rPr>
+            <w:rStyle w:val="Hipervnculo"/>
+            <w:rFonts w:ascii="Arial" w:hAnsi="Arial" w:cs="Arial"/>
+            <w:sz w:val="28"/>
+            <w:szCs w:val="28"/>
+          </w:rPr>
+          <w:t xml:space="preserve"> at </w:t>
+        </w:r>
+        <w:proofErr w:type="spellStart"/>
+        <w:r>
+          <w:rPr>
+            <w:rStyle w:val="Hipervnculo"/>
+            <w:rFonts w:ascii="Arial" w:hAnsi="Arial" w:cs="Arial"/>
+            <w:sz w:val="28"/>
+            <w:szCs w:val="28"/>
+          </w:rPr>
+          <w:t>main</w:t>
+        </w:r>
+        <w:proofErr w:type="spellEnd"/>
+        <w:r>
+          <w:rPr>
+            <w:rStyle w:val="Hipervnculo"/>
+            <w:rFonts w:ascii="Arial" w:hAnsi="Arial" w:cs="Arial"/>
+            <w:sz w:val="28"/>
+            <w:szCs w:val="28"/>
+          </w:rPr>
+          <w:t xml:space="preserve"> · erikalegria1999-cmd/tercer-Trimestre</w:t>
+        </w:r>
+      </w:hyperlink>
+    </w:p>
+    <w:p>
+      <w:pPr>
+        <w:spacing w:after="0" w:line="240" w:lineRule="auto"/>
+        <w:jc w:val="center"/>
+        <w:rPr>
+          <w:rFonts w:ascii="Arial" w:hAnsi="Arial" w:cs="Arial"/>
+          <w:sz w:val="28"/>
+          <w:szCs w:val="28"/>
+        </w:rPr>
+      </w:pPr>
+    </w:p>
+    <w:p>
+      <w:pPr>
+        <w:spacing w:after="0" w:line="240" w:lineRule="auto"/>
+        <w:jc w:val="center"/>
+        <w:rPr>
+          <w:rFonts w:ascii="Arial" w:hAnsi="Arial" w:cs="Arial"/>
+          <w:sz w:val="28"/>
+          <w:szCs w:val="28"/>
+        </w:rPr>
+      </w:pPr>
+    </w:p>
+    <w:p>
+      <w:pPr>
+        <w:spacing w:after="0" w:line="240" w:lineRule="auto"/>
+        <w:jc w:val="center"/>
+        <w:rPr>
+          <w:rFonts w:ascii="Arial" w:hAnsi="Arial" w:cs="Arial"/>
+          <w:sz w:val="28"/>
+          <w:szCs w:val="28"/>
+        </w:rPr>
+      </w:pPr>
+    </w:p>
     <w:sectPr>
-      <w:headerReference w:type="default" r:id="rId13"/>
+      <w:headerReference w:type="default" r:id="rId15"/>
       <w:pgSz w:w="12240" w:h="15840"/>
       <w:pgMar w:top="1417" w:right="1701" w:bottom="1417" w:left="1701" w:header="708" w:footer="708" w:gutter="0"/>
       <w:cols w:space="708"/>
@@ -6099,6 +6760,119 @@
     </w:lvl>
   </w:abstractNum>
   <w:abstractNum w:abstractNumId="4" w15:restartNumberingAfterBreak="0">
+    <w:nsid w:val="1CBE4CE4"/>
+    <w:multiLevelType w:val="hybridMultilevel"/>
+    <w:tmpl w:val="FD203DB4"/>
+    <w:lvl w:ilvl="0" w:tplc="240A0001">
+      <w:start w:val="1"/>
+      <w:numFmt w:val="bullet"/>
+      <w:lvlText w:val=""/>
+      <w:lvlJc w:val="left"/>
+      <w:pPr>
+        <w:ind w:left="720" w:hanging="360"/>
+      </w:pPr>
+      <w:rPr>
+        <w:rFonts w:ascii="Symbol" w:hAnsi="Symbol" w:hint="default"/>
+      </w:rPr>
+    </w:lvl>
+    <w:lvl w:ilvl="1" w:tplc="240A0003" w:tentative="1">
+      <w:start w:val="1"/>
+      <w:numFmt w:val="bullet"/>
+      <w:lvlText w:val="o"/>
+      <w:lvlJc w:val="left"/>
+      <w:pPr>
+        <w:ind w:left="1440" w:hanging="360"/>
+      </w:pPr>
+      <w:rPr>
+        <w:rFonts w:ascii="Courier New" w:hAnsi="Courier New" w:cs="Courier New" w:hint="default"/>
+      </w:rPr>
+    </w:lvl>
+    <w:lvl w:ilvl="2" w:tplc="240A0005" w:tentative="1">
+      <w:start w:val="1"/>
+      <w:numFmt w:val="bullet"/>
+      <w:lvlText w:val=""/>
+      <w:lvlJc w:val="left"/>
+      <w:pPr>
+        <w:ind w:left="2160" w:hanging="360"/>
+      </w:pPr>
+      <w:rPr>
+        <w:rFonts w:ascii="Wingdings" w:hAnsi="Wingdings" w:hint="default"/>
+      </w:rPr>
+    </w:lvl>
+    <w:lvl w:ilvl="3" w:tplc="240A0001" w:tentative="1">
+      <w:start w:val="1"/>
+      <w:numFmt w:val="bullet"/>
+      <w:lvlText w:val=""/>
+      <w:lvlJc w:val="left"/>
+      <w:pPr>
+        <w:ind w:left="2880" w:hanging="360"/>
+      </w:pPr>
+      <w:rPr>
+        <w:rFonts w:ascii="Symbol" w:hAnsi="Symbol" w:hint="default"/>
+      </w:rPr>
+    </w:lvl>
+    <w:lvl w:ilvl="4" w:tplc="240A0003" w:tentative="1">
+      <w:start w:val="1"/>
+      <w:numFmt w:val="bullet"/>
+      <w:lvlText w:val="o"/>
+      <w:lvlJc w:val="left"/>
+      <w:pPr>
+        <w:ind w:left="3600" w:hanging="360"/>
+      </w:pPr>
+      <w:rPr>
+        <w:rFonts w:ascii="Courier New" w:hAnsi="Courier New" w:cs="Courier New" w:hint="default"/>
+      </w:rPr>
+    </w:lvl>
+    <w:lvl w:ilvl="5" w:tplc="240A0005" w:tentative="1">
+      <w:start w:val="1"/>
+      <w:numFmt w:val="bullet"/>
+      <w:lvlText w:val=""/>
+      <w:lvlJc w:val="left"/>
+      <w:pPr>
+        <w:ind w:left="4320" w:hanging="360"/>
+      </w:pPr>
+      <w:rPr>
+        <w:rFonts w:ascii="Wingdings" w:hAnsi="Wingdings" w:hint="default"/>
+      </w:rPr>
+    </w:lvl>
+    <w:lvl w:ilvl="6" w:tplc="240A0001" w:tentative="1">
+      <w:start w:val="1"/>
+      <w:numFmt w:val="bullet"/>
+      <w:lvlText w:val=""/>
+      <w:lvlJc w:val="left"/>
+      <w:pPr>
+        <w:ind w:left="5040" w:hanging="360"/>
+      </w:pPr>
+      <w:rPr>
+        <w:rFonts w:ascii="Symbol" w:hAnsi="Symbol" w:hint="default"/>
+      </w:rPr>
+    </w:lvl>
+    <w:lvl w:ilvl="7" w:tplc="240A0003" w:tentative="1">
+      <w:start w:val="1"/>
+      <w:numFmt w:val="bullet"/>
+      <w:lvlText w:val="o"/>
+      <w:lvlJc w:val="left"/>
+      <w:pPr>
+        <w:ind w:left="5760" w:hanging="360"/>
+      </w:pPr>
+      <w:rPr>
+        <w:rFonts w:ascii="Courier New" w:hAnsi="Courier New" w:cs="Courier New" w:hint="default"/>
+      </w:rPr>
+    </w:lvl>
+    <w:lvl w:ilvl="8" w:tplc="240A0005" w:tentative="1">
+      <w:start w:val="1"/>
+      <w:numFmt w:val="bullet"/>
+      <w:lvlText w:val=""/>
+      <w:lvlJc w:val="left"/>
+      <w:pPr>
+        <w:ind w:left="6480" w:hanging="360"/>
+      </w:pPr>
+      <w:rPr>
+        <w:rFonts w:ascii="Wingdings" w:hAnsi="Wingdings" w:hint="default"/>
+      </w:rPr>
+    </w:lvl>
+  </w:abstractNum>
+  <w:abstractNum w:abstractNumId="5" w15:restartNumberingAfterBreak="0">
     <w:nsid w:val="236C24D7"/>
     <w:multiLevelType w:val="hybridMultilevel"/>
     <w:tmpl w:val="1F24EA76"/>
@@ -6211,7 +6985,7 @@
       </w:rPr>
     </w:lvl>
   </w:abstractNum>
-  <w:abstractNum w:abstractNumId="5" w15:restartNumberingAfterBreak="0">
+  <w:abstractNum w:abstractNumId="6" w15:restartNumberingAfterBreak="0">
     <w:nsid w:val="26030031"/>
     <w:multiLevelType w:val="hybridMultilevel"/>
     <w:tmpl w:val="FFCA8360"/>
@@ -6324,7 +7098,7 @@
       </w:rPr>
     </w:lvl>
   </w:abstractNum>
-  <w:abstractNum w:abstractNumId="6" w15:restartNumberingAfterBreak="0">
+  <w:abstractNum w:abstractNumId="7" w15:restartNumberingAfterBreak="0">
     <w:nsid w:val="2E4B3273"/>
     <w:multiLevelType w:val="hybridMultilevel"/>
     <w:tmpl w:val="3E6E6A9E"/>
@@ -6410,10 +7184,10 @@
       </w:pPr>
     </w:lvl>
   </w:abstractNum>
-  <w:abstractNum w:abstractNumId="7" w15:restartNumberingAfterBreak="0">
+  <w:abstractNum w:abstractNumId="8" w15:restartNumberingAfterBreak="0">
     <w:nsid w:val="2F673894"/>
     <w:multiLevelType w:val="hybridMultilevel"/>
-    <w:tmpl w:val="9DB48F7E"/>
+    <w:tmpl w:val="3C3E793C"/>
     <w:lvl w:ilvl="0" w:tplc="240A0001">
       <w:start w:val="1"/>
       <w:numFmt w:val="bullet"/>
@@ -6523,7 +7297,7 @@
       </w:rPr>
     </w:lvl>
   </w:abstractNum>
-  <w:abstractNum w:abstractNumId="8" w15:restartNumberingAfterBreak="0">
+  <w:abstractNum w:abstractNumId="9" w15:restartNumberingAfterBreak="0">
     <w:nsid w:val="33876EA3"/>
     <w:multiLevelType w:val="hybridMultilevel"/>
     <w:tmpl w:val="5C84B76E"/>
@@ -6636,7 +7410,7 @@
       </w:rPr>
     </w:lvl>
   </w:abstractNum>
-  <w:abstractNum w:abstractNumId="9" w15:restartNumberingAfterBreak="0">
+  <w:abstractNum w:abstractNumId="10" w15:restartNumberingAfterBreak="0">
     <w:nsid w:val="35CF7CB1"/>
     <w:multiLevelType w:val="hybridMultilevel"/>
     <w:tmpl w:val="B8A2D234"/>
@@ -6749,10 +7523,10 @@
       </w:rPr>
     </w:lvl>
   </w:abstractNum>
-  <w:abstractNum w:abstractNumId="10" w15:restartNumberingAfterBreak="0">
+  <w:abstractNum w:abstractNumId="11" w15:restartNumberingAfterBreak="0">
     <w:nsid w:val="38C635CB"/>
     <w:multiLevelType w:val="hybridMultilevel"/>
-    <w:tmpl w:val="D97E5288"/>
+    <w:tmpl w:val="919820C4"/>
     <w:lvl w:ilvl="0" w:tplc="240A0001">
       <w:start w:val="1"/>
       <w:numFmt w:val="bullet"/>
@@ -6862,7 +7636,7 @@
       </w:rPr>
     </w:lvl>
   </w:abstractNum>
-  <w:abstractNum w:abstractNumId="11" w15:restartNumberingAfterBreak="0">
+  <w:abstractNum w:abstractNumId="12" w15:restartNumberingAfterBreak="0">
     <w:nsid w:val="40F70E96"/>
     <w:multiLevelType w:val="hybridMultilevel"/>
     <w:tmpl w:val="A1CEEEA2"/>
@@ -6951,7 +7725,7 @@
       </w:pPr>
     </w:lvl>
   </w:abstractNum>
-  <w:abstractNum w:abstractNumId="12" w15:restartNumberingAfterBreak="0">
+  <w:abstractNum w:abstractNumId="13" w15:restartNumberingAfterBreak="0">
     <w:nsid w:val="44011D57"/>
     <w:multiLevelType w:val="hybridMultilevel"/>
     <w:tmpl w:val="A2007A7A"/>
@@ -7009,7 +7783,233 @@
       <w:lvlJc w:val="left"/>
     </w:lvl>
   </w:abstractNum>
-  <w:abstractNum w:abstractNumId="13" w15:restartNumberingAfterBreak="0">
+  <w:abstractNum w:abstractNumId="14" w15:restartNumberingAfterBreak="0">
+    <w:nsid w:val="45C009E3"/>
+    <w:multiLevelType w:val="hybridMultilevel"/>
+    <w:tmpl w:val="BEB6DC3E"/>
+    <w:lvl w:ilvl="0" w:tplc="240A000F">
+      <w:start w:val="1"/>
+      <w:numFmt w:val="decimal"/>
+      <w:lvlText w:val="%1."/>
+      <w:lvlJc w:val="left"/>
+      <w:pPr>
+        <w:ind w:left="720" w:hanging="360"/>
+      </w:pPr>
+      <w:rPr>
+        <w:rFonts w:hint="default"/>
+      </w:rPr>
+    </w:lvl>
+    <w:lvl w:ilvl="1" w:tplc="FFFFFFFF" w:tentative="1">
+      <w:start w:val="1"/>
+      <w:numFmt w:val="bullet"/>
+      <w:lvlText w:val="o"/>
+      <w:lvlJc w:val="left"/>
+      <w:pPr>
+        <w:ind w:left="1440" w:hanging="360"/>
+      </w:pPr>
+      <w:rPr>
+        <w:rFonts w:ascii="Courier New" w:hAnsi="Courier New" w:cs="Courier New" w:hint="default"/>
+      </w:rPr>
+    </w:lvl>
+    <w:lvl w:ilvl="2" w:tplc="FFFFFFFF" w:tentative="1">
+      <w:start w:val="1"/>
+      <w:numFmt w:val="bullet"/>
+      <w:lvlText w:val=""/>
+      <w:lvlJc w:val="left"/>
+      <w:pPr>
+        <w:ind w:left="2160" w:hanging="360"/>
+      </w:pPr>
+      <w:rPr>
+        <w:rFonts w:ascii="Wingdings" w:hAnsi="Wingdings" w:hint="default"/>
+      </w:rPr>
+    </w:lvl>
+    <w:lvl w:ilvl="3" w:tplc="FFFFFFFF" w:tentative="1">
+      <w:start w:val="1"/>
+      <w:numFmt w:val="bullet"/>
+      <w:lvlText w:val=""/>
+      <w:lvlJc w:val="left"/>
+      <w:pPr>
+        <w:ind w:left="2880" w:hanging="360"/>
+      </w:pPr>
+      <w:rPr>
+        <w:rFonts w:ascii="Symbol" w:hAnsi="Symbol" w:hint="default"/>
+      </w:rPr>
+    </w:lvl>
+    <w:lvl w:ilvl="4" w:tplc="FFFFFFFF" w:tentative="1">
+      <w:start w:val="1"/>
+      <w:numFmt w:val="bullet"/>
+      <w:lvlText w:val="o"/>
+      <w:lvlJc w:val="left"/>
+      <w:pPr>
+        <w:ind w:left="3600" w:hanging="360"/>
+      </w:pPr>
+      <w:rPr>
+        <w:rFonts w:ascii="Courier New" w:hAnsi="Courier New" w:cs="Courier New" w:hint="default"/>
+      </w:rPr>
+    </w:lvl>
+    <w:lvl w:ilvl="5" w:tplc="FFFFFFFF" w:tentative="1">
+      <w:start w:val="1"/>
+      <w:numFmt w:val="bullet"/>
+      <w:lvlText w:val=""/>
+      <w:lvlJc w:val="left"/>
+      <w:pPr>
+        <w:ind w:left="4320" w:hanging="360"/>
+      </w:pPr>
+      <w:rPr>
+        <w:rFonts w:ascii="Wingdings" w:hAnsi="Wingdings" w:hint="default"/>
+      </w:rPr>
+    </w:lvl>
+    <w:lvl w:ilvl="6" w:tplc="FFFFFFFF" w:tentative="1">
+      <w:start w:val="1"/>
+      <w:numFmt w:val="bullet"/>
+      <w:lvlText w:val=""/>
+      <w:lvlJc w:val="left"/>
+      <w:pPr>
+        <w:ind w:left="5040" w:hanging="360"/>
+      </w:pPr>
+      <w:rPr>
+        <w:rFonts w:ascii="Symbol" w:hAnsi="Symbol" w:hint="default"/>
+      </w:rPr>
+    </w:lvl>
+    <w:lvl w:ilvl="7" w:tplc="FFFFFFFF" w:tentative="1">
+      <w:start w:val="1"/>
+      <w:numFmt w:val="bullet"/>
+      <w:lvlText w:val="o"/>
+      <w:lvlJc w:val="left"/>
+      <w:pPr>
+        <w:ind w:left="5760" w:hanging="360"/>
+      </w:pPr>
+      <w:rPr>
+        <w:rFonts w:ascii="Courier New" w:hAnsi="Courier New" w:cs="Courier New" w:hint="default"/>
+      </w:rPr>
+    </w:lvl>
+    <w:lvl w:ilvl="8" w:tplc="FFFFFFFF" w:tentative="1">
+      <w:start w:val="1"/>
+      <w:numFmt w:val="bullet"/>
+      <w:lvlText w:val=""/>
+      <w:lvlJc w:val="left"/>
+      <w:pPr>
+        <w:ind w:left="6480" w:hanging="360"/>
+      </w:pPr>
+      <w:rPr>
+        <w:rFonts w:ascii="Wingdings" w:hAnsi="Wingdings" w:hint="default"/>
+      </w:rPr>
+    </w:lvl>
+  </w:abstractNum>
+  <w:abstractNum w:abstractNumId="15" w15:restartNumberingAfterBreak="0">
+    <w:nsid w:val="5E95428D"/>
+    <w:multiLevelType w:val="hybridMultilevel"/>
+    <w:tmpl w:val="0BE4712A"/>
+    <w:lvl w:ilvl="0" w:tplc="240A0001">
+      <w:start w:val="1"/>
+      <w:numFmt w:val="bullet"/>
+      <w:lvlText w:val=""/>
+      <w:lvlJc w:val="left"/>
+      <w:pPr>
+        <w:ind w:left="720" w:hanging="360"/>
+      </w:pPr>
+      <w:rPr>
+        <w:rFonts w:ascii="Symbol" w:hAnsi="Symbol" w:hint="default"/>
+      </w:rPr>
+    </w:lvl>
+    <w:lvl w:ilvl="1" w:tplc="FFFFFFFF" w:tentative="1">
+      <w:start w:val="1"/>
+      <w:numFmt w:val="bullet"/>
+      <w:lvlText w:val="o"/>
+      <w:lvlJc w:val="left"/>
+      <w:pPr>
+        <w:ind w:left="1440" w:hanging="360"/>
+      </w:pPr>
+      <w:rPr>
+        <w:rFonts w:ascii="Courier New" w:hAnsi="Courier New" w:cs="Courier New" w:hint="default"/>
+      </w:rPr>
+    </w:lvl>
+    <w:lvl w:ilvl="2" w:tplc="FFFFFFFF" w:tentative="1">
+      <w:start w:val="1"/>
+      <w:numFmt w:val="bullet"/>
+      <w:lvlText w:val=""/>
+      <w:lvlJc w:val="left"/>
+      <w:pPr>
+        <w:ind w:left="2160" w:hanging="360"/>
+      </w:pPr>
+      <w:rPr>
+        <w:rFonts w:ascii="Wingdings" w:hAnsi="Wingdings" w:hint="default"/>
+      </w:rPr>
+    </w:lvl>
+    <w:lvl w:ilvl="3" w:tplc="FFFFFFFF" w:tentative="1">
+      <w:start w:val="1"/>
+      <w:numFmt w:val="bullet"/>
+      <w:lvlText w:val=""/>
+      <w:lvlJc w:val="left"/>
+      <w:pPr>
+        <w:ind w:left="2880" w:hanging="360"/>
+      </w:pPr>
+      <w:rPr>
+        <w:rFonts w:ascii="Symbol" w:hAnsi="Symbol" w:hint="default"/>
+      </w:rPr>
+    </w:lvl>
+    <w:lvl w:ilvl="4" w:tplc="FFFFFFFF" w:tentative="1">
+      <w:start w:val="1"/>
+      <w:numFmt w:val="bullet"/>
+      <w:lvlText w:val="o"/>
+      <w:lvlJc w:val="left"/>
+      <w:pPr>
+        <w:ind w:left="3600" w:hanging="360"/>
+      </w:pPr>
+      <w:rPr>
+        <w:rFonts w:ascii="Courier New" w:hAnsi="Courier New" w:cs="Courier New" w:hint="default"/>
+      </w:rPr>
+    </w:lvl>
+    <w:lvl w:ilvl="5" w:tplc="FFFFFFFF" w:tentative="1">
+      <w:start w:val="1"/>
+      <w:numFmt w:val="bullet"/>
+      <w:lvlText w:val=""/>
+      <w:lvlJc w:val="left"/>
+      <w:pPr>
+        <w:ind w:left="4320" w:hanging="360"/>
+      </w:pPr>
+      <w:rPr>
+        <w:rFonts w:ascii="Wingdings" w:hAnsi="Wingdings" w:hint="default"/>
+      </w:rPr>
+    </w:lvl>
+    <w:lvl w:ilvl="6" w:tplc="FFFFFFFF" w:tentative="1">
+      <w:start w:val="1"/>
+      <w:numFmt w:val="bullet"/>
+      <w:lvlText w:val=""/>
+      <w:lvlJc w:val="left"/>
+      <w:pPr>
+        <w:ind w:left="5040" w:hanging="360"/>
+      </w:pPr>
+      <w:rPr>
+        <w:rFonts w:ascii="Symbol" w:hAnsi="Symbol" w:hint="default"/>
+      </w:rPr>
+    </w:lvl>
+    <w:lvl w:ilvl="7" w:tplc="FFFFFFFF" w:tentative="1">
+      <w:start w:val="1"/>
+      <w:numFmt w:val="bullet"/>
+      <w:lvlText w:val="o"/>
+      <w:lvlJc w:val="left"/>
+      <w:pPr>
+        <w:ind w:left="5760" w:hanging="360"/>
+      </w:pPr>
+      <w:rPr>
+        <w:rFonts w:ascii="Courier New" w:hAnsi="Courier New" w:cs="Courier New" w:hint="default"/>
+      </w:rPr>
+    </w:lvl>
+    <w:lvl w:ilvl="8" w:tplc="FFFFFFFF" w:tentative="1">
+      <w:start w:val="1"/>
+      <w:numFmt w:val="bullet"/>
+      <w:lvlText w:val=""/>
+      <w:lvlJc w:val="left"/>
+      <w:pPr>
+        <w:ind w:left="6480" w:hanging="360"/>
+      </w:pPr>
+      <w:rPr>
+        <w:rFonts w:ascii="Wingdings" w:hAnsi="Wingdings" w:hint="default"/>
+      </w:rPr>
+    </w:lvl>
+  </w:abstractNum>
+  <w:abstractNum w:abstractNumId="16" w15:restartNumberingAfterBreak="0">
     <w:nsid w:val="61B939F3"/>
     <w:multiLevelType w:val="hybridMultilevel"/>
     <w:tmpl w:val="BEE02890"/>
@@ -7122,7 +8122,7 @@
       </w:rPr>
     </w:lvl>
   </w:abstractNum>
-  <w:abstractNum w:abstractNumId="14" w15:restartNumberingAfterBreak="0">
+  <w:abstractNum w:abstractNumId="17" w15:restartNumberingAfterBreak="0">
     <w:nsid w:val="63323659"/>
     <w:multiLevelType w:val="hybridMultilevel"/>
     <w:tmpl w:val="7DCC826E"/>
@@ -7235,7 +8235,7 @@
       </w:rPr>
     </w:lvl>
   </w:abstractNum>
-  <w:abstractNum w:abstractNumId="15" w15:restartNumberingAfterBreak="0">
+  <w:abstractNum w:abstractNumId="18" w15:restartNumberingAfterBreak="0">
     <w:nsid w:val="6BDDCD15"/>
     <w:multiLevelType w:val="hybridMultilevel"/>
     <w:tmpl w:val="FFFFFFFF"/>
@@ -7286,7 +8286,7 @@
       <w:lvlJc w:val="left"/>
     </w:lvl>
   </w:abstractNum>
-  <w:abstractNum w:abstractNumId="16" w15:restartNumberingAfterBreak="0">
+  <w:abstractNum w:abstractNumId="19" w15:restartNumberingAfterBreak="0">
     <w:nsid w:val="792C6A7D"/>
     <w:multiLevelType w:val="hybridMultilevel"/>
     <w:tmpl w:val="34FAC1AA"/>
@@ -7372,7 +8372,7 @@
       </w:pPr>
     </w:lvl>
   </w:abstractNum>
-  <w:abstractNum w:abstractNumId="17" w15:restartNumberingAfterBreak="0">
+  <w:abstractNum w:abstractNumId="20" w15:restartNumberingAfterBreak="0">
     <w:nsid w:val="7ECC21B8"/>
     <w:multiLevelType w:val="hybridMultilevel"/>
     <w:tmpl w:val="8AA6ACA0"/>
@@ -7462,58 +8462,67 @@
     </w:lvl>
   </w:abstractNum>
   <w:num w:numId="1" w16cid:durableId="1377240028">
-    <w:abstractNumId w:val="15"/>
+    <w:abstractNumId w:val="18"/>
   </w:num>
   <w:num w:numId="2" w16cid:durableId="1157846666">
-    <w:abstractNumId w:val="17"/>
+    <w:abstractNumId w:val="20"/>
   </w:num>
   <w:num w:numId="3" w16cid:durableId="1181898271">
-    <w:abstractNumId w:val="11"/>
+    <w:abstractNumId w:val="12"/>
   </w:num>
   <w:num w:numId="4" w16cid:durableId="608582843">
-    <w:abstractNumId w:val="4"/>
+    <w:abstractNumId w:val="5"/>
   </w:num>
   <w:num w:numId="5" w16cid:durableId="1030110546">
-    <w:abstractNumId w:val="6"/>
+    <w:abstractNumId w:val="7"/>
   </w:num>
   <w:num w:numId="6" w16cid:durableId="1811945866">
-    <w:abstractNumId w:val="16"/>
+    <w:abstractNumId w:val="19"/>
   </w:num>
   <w:num w:numId="7" w16cid:durableId="1400788160">
     <w:abstractNumId w:val="3"/>
   </w:num>
   <w:num w:numId="8" w16cid:durableId="1273324539">
-    <w:abstractNumId w:val="12"/>
+    <w:abstractNumId w:val="13"/>
   </w:num>
   <w:num w:numId="9" w16cid:durableId="1246913996">
     <w:abstractNumId w:val="2"/>
   </w:num>
   <w:num w:numId="10" w16cid:durableId="963343245">
-    <w:abstractNumId w:val="5"/>
+    <w:abstractNumId w:val="6"/>
   </w:num>
   <w:num w:numId="11" w16cid:durableId="667905309">
-    <w:abstractNumId w:val="8"/>
+    <w:abstractNumId w:val="9"/>
   </w:num>
   <w:num w:numId="12" w16cid:durableId="440540500">
-    <w:abstractNumId w:val="13"/>
+    <w:abstractNumId w:val="16"/>
   </w:num>
   <w:num w:numId="13" w16cid:durableId="1633053630">
-    <w:abstractNumId w:val="9"/>
+    <w:abstractNumId w:val="10"/>
   </w:num>
   <w:num w:numId="14" w16cid:durableId="662200028">
-    <w:abstractNumId w:val="14"/>
+    <w:abstractNumId w:val="17"/>
   </w:num>
   <w:num w:numId="15" w16cid:durableId="1292398525">
     <w:abstractNumId w:val="1"/>
   </w:num>
   <w:num w:numId="16" w16cid:durableId="30611448">
-    <w:abstractNumId w:val="10"/>
+    <w:abstractNumId w:val="11"/>
   </w:num>
   <w:num w:numId="17" w16cid:durableId="1262910633">
-    <w:abstractNumId w:val="7"/>
+    <w:abstractNumId w:val="8"/>
   </w:num>
   <w:num w:numId="18" w16cid:durableId="30886940">
     <w:abstractNumId w:val="0"/>
+  </w:num>
+  <w:num w:numId="19" w16cid:durableId="1170871267">
+    <w:abstractNumId w:val="4"/>
+  </w:num>
+  <w:num w:numId="20" w16cid:durableId="1940215862">
+    <w:abstractNumId w:val="14"/>
+  </w:num>
+  <w:num w:numId="21" w16cid:durableId="1829134532">
+    <w:abstractNumId w:val="15"/>
   </w:num>
 </w:numbering>
 </file>
@@ -8227,6 +9236,30 @@
       </w:tblBorders>
     </w:tblPr>
   </w:style>
+  <w:style w:type="character" w:styleId="Mencinsinresolver">
+    <w:name w:val="Unresolved Mention"/>
+    <w:basedOn w:val="Fuentedeprrafopredeter"/>
+    <w:uiPriority w:val="99"/>
+    <w:semiHidden/>
+    <w:unhideWhenUsed/>
+    <w:rsid w:val="00BF611D"/>
+    <w:rPr>
+      <w:color w:val="605E5C"/>
+      <w:shd w:val="clear" w:color="auto" w:fill="E1DFDD"/>
+    </w:rPr>
+  </w:style>
+  <w:style w:type="character" w:styleId="Hipervnculovisitado">
+    <w:name w:val="FollowedHyperlink"/>
+    <w:basedOn w:val="Fuentedeprrafopredeter"/>
+    <w:uiPriority w:val="99"/>
+    <w:semiHidden/>
+    <w:unhideWhenUsed/>
+    <w:rsid w:val="00A4401A"/>
+    <w:rPr>
+      <w:color w:val="954F72" w:themeColor="followedHyperlink"/>
+      <w:u w:val="single"/>
+    </w:rPr>
+  </w:style>
 </w:styles>
 </file>
 

</xml_diff>